<commit_message>
Added Practical Experiments and Assignments 20:15 3-11-25
</commit_message>
<xml_diff>
--- a/7Sem/supervised learning/SDL LAB FILE.docx
+++ b/7Sem/supervised learning/SDL LAB FILE.docx
@@ -11588,25 +11588,14 @@
         <w:t xml:space="preserve"> </w:t>
       </w:r>
       <w:proofErr w:type="spellStart"/>
-      <w:proofErr w:type="gramStart"/>
-      <w:r>
-        <w:rPr>
-          <w:color w:val="000000"/>
-          <w:sz w:val="28"/>
-          <w:szCs w:val="28"/>
-          <w:lang w:val="en-US"/>
-        </w:rPr>
-        <w:t>sklearn.datasets</w:t>
-      </w:r>
-      <w:proofErr w:type="gramEnd"/>
-      <w:r>
-        <w:rPr>
-          <w:color w:val="000000"/>
-          <w:sz w:val="28"/>
-          <w:szCs w:val="28"/>
-          <w:lang w:val="en-US"/>
-        </w:rPr>
-        <w:t>.fetch_california_housing</w:t>
+      <w:r>
+        <w:rPr>
+          <w:color w:val="000000"/>
+          <w:sz w:val="28"/>
+          <w:szCs w:val="28"/>
+          <w:lang w:val="en-US"/>
+        </w:rPr>
+        <w:t>sklearn.datasets.fetch_california_housing</w:t>
       </w:r>
       <w:proofErr w:type="spellEnd"/>
       <w:r>
@@ -13197,25 +13186,7 @@
           <w:sz w:val="28"/>
           <w:szCs w:val="28"/>
         </w:rPr>
-        <w:t xml:space="preserve">Where w is the weight vector and b </w:t>
-      </w:r>
-      <w:proofErr w:type="gramStart"/>
-      <w:r>
-        <w:rPr>
-          <w:bCs/>
-          <w:sz w:val="28"/>
-          <w:szCs w:val="28"/>
-        </w:rPr>
-        <w:t>is</w:t>
-      </w:r>
-      <w:proofErr w:type="gramEnd"/>
-      <w:r>
-        <w:rPr>
-          <w:bCs/>
-          <w:sz w:val="28"/>
-          <w:szCs w:val="28"/>
-        </w:rPr>
-        <w:t xml:space="preserve"> the bias.</w:t>
+        <w:t>Where w is the weight vector and b is the bias.</w:t>
       </w:r>
     </w:p>
     <w:p>
@@ -13556,7 +13527,6 @@
         <w:t xml:space="preserve">A small image dataset available in </w:t>
       </w:r>
       <w:proofErr w:type="spellStart"/>
-      <w:proofErr w:type="gramStart"/>
       <w:r>
         <w:rPr>
           <w:bCs/>
@@ -13566,7 +13536,6 @@
         <w:t>sklearn.datasets</w:t>
       </w:r>
       <w:proofErr w:type="spellEnd"/>
-      <w:proofErr w:type="gramEnd"/>
       <w:r>
         <w:rPr>
           <w:bCs/>
@@ -14787,7 +14756,6 @@
         <w:t xml:space="preserve">Available in </w:t>
       </w:r>
       <w:proofErr w:type="spellStart"/>
-      <w:proofErr w:type="gramStart"/>
       <w:r>
         <w:rPr>
           <w:bCs/>
@@ -14797,7 +14765,6 @@
         <w:t>sklearn.datasets</w:t>
       </w:r>
       <w:proofErr w:type="spellEnd"/>
-      <w:proofErr w:type="gramEnd"/>
       <w:r>
         <w:rPr>
           <w:bCs/>
@@ -15680,25 +15647,7 @@
           <w:sz w:val="28"/>
           <w:szCs w:val="28"/>
         </w:rPr>
-        <w:t xml:space="preserve">Where w is the weight vector and b </w:t>
-      </w:r>
-      <w:proofErr w:type="gramStart"/>
-      <w:r>
-        <w:rPr>
-          <w:bCs/>
-          <w:sz w:val="28"/>
-          <w:szCs w:val="28"/>
-        </w:rPr>
-        <w:t>is</w:t>
-      </w:r>
-      <w:proofErr w:type="gramEnd"/>
-      <w:r>
-        <w:rPr>
-          <w:bCs/>
-          <w:sz w:val="28"/>
-          <w:szCs w:val="28"/>
-        </w:rPr>
-        <w:t xml:space="preserve"> the bias.</w:t>
+        <w:t>Where w is the weight vector and b is the bias.</w:t>
       </w:r>
     </w:p>
     <w:p>
@@ -16061,25 +16010,7 @@
           <w:sz w:val="28"/>
           <w:szCs w:val="28"/>
         </w:rPr>
-        <w:t xml:space="preserve">Features: </w:t>
-      </w:r>
-      <w:proofErr w:type="gramStart"/>
-      <w:r>
-        <w:rPr>
-          <w:bCs/>
-          <w:sz w:val="28"/>
-          <w:szCs w:val="28"/>
-        </w:rPr>
-        <w:t>64 pixel</w:t>
-      </w:r>
-      <w:proofErr w:type="gramEnd"/>
-      <w:r>
-        <w:rPr>
-          <w:bCs/>
-          <w:sz w:val="28"/>
-          <w:szCs w:val="28"/>
-        </w:rPr>
-        <w:t xml:space="preserve"> intensity values per sample.</w:t>
+        <w:t>Features: 64 pixel intensity values per sample.</w:t>
       </w:r>
     </w:p>
     <w:p>
@@ -17090,7 +17021,7 @@
           <w:lang w:val="en-IN"/>
         </w:rPr>
         <w:drawing>
-          <wp:inline distT="0" distB="0" distL="0" distR="0" wp14:anchorId="36074937" wp14:editId="240FD7F1">
+          <wp:inline distT="0" distB="0" distL="0" distR="0" wp14:anchorId="36074937" wp14:editId="7EB7BCBD">
             <wp:extent cx="19050" cy="139700"/>
             <wp:effectExtent l="0" t="0" r="19050" b="0"/>
             <wp:docPr id="2008464009" name="Picture 19"/>
@@ -17179,7 +17110,7 @@
           <w:lang w:val="en-IN"/>
         </w:rPr>
         <w:drawing>
-          <wp:inline distT="0" distB="0" distL="0" distR="0" wp14:anchorId="50908644" wp14:editId="0E95CE16">
+          <wp:inline distT="0" distB="0" distL="0" distR="0" wp14:anchorId="50908644" wp14:editId="50F5BF46">
             <wp:extent cx="19050" cy="139700"/>
             <wp:effectExtent l="0" t="0" r="19050" b="0"/>
             <wp:docPr id="1869498235" name="Picture 18"/>
@@ -17329,7 +17260,7 @@
           <w:lang w:val="en-IN"/>
         </w:rPr>
         <w:drawing>
-          <wp:inline distT="0" distB="0" distL="0" distR="0" wp14:anchorId="537BBCE3" wp14:editId="12ACE9E6">
+          <wp:inline distT="0" distB="0" distL="0" distR="0" wp14:anchorId="537BBCE3" wp14:editId="4AC70ACA">
             <wp:extent cx="19050" cy="139700"/>
             <wp:effectExtent l="0" t="0" r="19050" b="0"/>
             <wp:docPr id="605662403" name="Picture 17"/>
@@ -17377,7 +17308,6 @@
           </wp:inline>
         </w:drawing>
       </w:r>
-      <w:proofErr w:type="gramStart"/>
       <w:r>
         <w:rPr>
           <w:bCs/>
@@ -17385,48 +17315,18 @@
           <w:szCs w:val="28"/>
           <w:lang w:val="en-IN"/>
         </w:rPr>
-        <w:t>C)P</w:t>
-      </w:r>
-      <w:proofErr w:type="gramEnd"/>
-      <w:r>
-        <w:rPr>
-          <w:bCs/>
+        <w:t>C)P(X|C)P(X</w:t>
+      </w:r>
+      <w:r>
+        <w:rPr>
+          <w:bCs/>
+          <w:noProof/>
           <w:sz w:val="28"/>
           <w:szCs w:val="28"/>
           <w:lang w:val="en-IN"/>
         </w:rPr>
-        <w:t>(X|</w:t>
-      </w:r>
-      <w:proofErr w:type="gramStart"/>
-      <w:r>
-        <w:rPr>
-          <w:bCs/>
-          <w:sz w:val="28"/>
-          <w:szCs w:val="28"/>
-          <w:lang w:val="en-IN"/>
-        </w:rPr>
-        <w:t>C)P</w:t>
-      </w:r>
-      <w:proofErr w:type="gramEnd"/>
-      <w:r>
-        <w:rPr>
-          <w:bCs/>
-          <w:sz w:val="28"/>
-          <w:szCs w:val="28"/>
-          <w:lang w:val="en-IN"/>
-        </w:rPr>
-        <w:t>(X</w:t>
-      </w:r>
-      <w:r>
-        <w:rPr>
-          <w:bCs/>
-          <w:noProof/>
-          <w:sz w:val="28"/>
-          <w:szCs w:val="28"/>
-          <w:lang w:val="en-IN"/>
-        </w:rPr>
         <w:drawing>
-          <wp:inline distT="0" distB="0" distL="0" distR="0" wp14:anchorId="4D0A36AB" wp14:editId="36F290E1">
+          <wp:inline distT="0" distB="0" distL="0" distR="0" wp14:anchorId="4D0A36AB" wp14:editId="7B74CC1A">
             <wp:extent cx="19050" cy="139700"/>
             <wp:effectExtent l="0" t="0" r="19050" b="0"/>
             <wp:docPr id="1181050773" name="Picture 16"/>
@@ -18685,6 +18585,3296 @@
         </w:rPr>
         <w:t xml:space="preserve"> </w:t>
       </w:r>
+    </w:p>
+    <w:p>
+      <w:pPr>
+        <w:rPr>
+          <w:b/>
+          <w:sz w:val="28"/>
+          <w:szCs w:val="28"/>
+          <w:lang w:val="en-IN"/>
+        </w:rPr>
+      </w:pPr>
+    </w:p>
+    <w:p>
+      <w:pPr>
+        <w:rPr>
+          <w:b/>
+          <w:sz w:val="28"/>
+          <w:szCs w:val="28"/>
+          <w:lang w:val="en-IN"/>
+        </w:rPr>
+      </w:pPr>
+    </w:p>
+    <w:p>
+      <w:pPr>
+        <w:rPr>
+          <w:b/>
+          <w:sz w:val="28"/>
+          <w:szCs w:val="28"/>
+          <w:lang w:val="en-IN"/>
+        </w:rPr>
+      </w:pPr>
+    </w:p>
+    <w:p>
+      <w:pPr>
+        <w:rPr>
+          <w:b/>
+          <w:sz w:val="28"/>
+          <w:szCs w:val="28"/>
+          <w:lang w:val="en-IN"/>
+        </w:rPr>
+      </w:pPr>
+    </w:p>
+    <w:p>
+      <w:pPr>
+        <w:rPr>
+          <w:b/>
+          <w:sz w:val="28"/>
+          <w:szCs w:val="28"/>
+          <w:lang w:val="en-IN"/>
+        </w:rPr>
+      </w:pPr>
+    </w:p>
+    <w:p>
+      <w:pPr>
+        <w:rPr>
+          <w:b/>
+          <w:sz w:val="28"/>
+          <w:szCs w:val="28"/>
+          <w:lang w:val="en-IN"/>
+        </w:rPr>
+      </w:pPr>
+    </w:p>
+    <w:p>
+      <w:pPr>
+        <w:rPr>
+          <w:b/>
+          <w:sz w:val="28"/>
+          <w:szCs w:val="28"/>
+          <w:lang w:val="en-IN"/>
+        </w:rPr>
+      </w:pPr>
+    </w:p>
+    <w:p>
+      <w:pPr>
+        <w:rPr>
+          <w:b/>
+          <w:sz w:val="28"/>
+          <w:szCs w:val="28"/>
+          <w:lang w:val="en-IN"/>
+        </w:rPr>
+      </w:pPr>
+    </w:p>
+    <w:p>
+      <w:pPr>
+        <w:rPr>
+          <w:b/>
+          <w:sz w:val="28"/>
+          <w:szCs w:val="28"/>
+          <w:lang w:val="en-IN"/>
+        </w:rPr>
+      </w:pPr>
+    </w:p>
+    <w:p>
+      <w:pPr>
+        <w:rPr>
+          <w:b/>
+          <w:sz w:val="28"/>
+          <w:szCs w:val="28"/>
+          <w:lang w:val="en-IN"/>
+        </w:rPr>
+      </w:pPr>
+    </w:p>
+    <w:p>
+      <w:pPr>
+        <w:rPr>
+          <w:b/>
+          <w:sz w:val="28"/>
+          <w:szCs w:val="28"/>
+          <w:lang w:val="en-IN"/>
+        </w:rPr>
+      </w:pPr>
+    </w:p>
+    <w:p>
+      <w:pPr>
+        <w:rPr>
+          <w:b/>
+          <w:sz w:val="28"/>
+          <w:szCs w:val="28"/>
+          <w:lang w:val="en-IN"/>
+        </w:rPr>
+      </w:pPr>
+    </w:p>
+    <w:p>
+      <w:pPr>
+        <w:rPr>
+          <w:b/>
+          <w:sz w:val="28"/>
+          <w:szCs w:val="28"/>
+          <w:lang w:val="en-IN"/>
+        </w:rPr>
+      </w:pPr>
+    </w:p>
+    <w:p>
+      <w:pPr>
+        <w:rPr>
+          <w:b/>
+          <w:sz w:val="28"/>
+          <w:szCs w:val="28"/>
+          <w:lang w:val="en-IN"/>
+        </w:rPr>
+      </w:pPr>
+    </w:p>
+    <w:p>
+      <w:pPr>
+        <w:rPr>
+          <w:b/>
+          <w:sz w:val="28"/>
+          <w:szCs w:val="28"/>
+          <w:lang w:val="en-IN"/>
+        </w:rPr>
+      </w:pPr>
+    </w:p>
+    <w:p>
+      <w:pPr>
+        <w:rPr>
+          <w:b/>
+          <w:sz w:val="28"/>
+          <w:szCs w:val="28"/>
+          <w:lang w:val="en-IN"/>
+        </w:rPr>
+      </w:pPr>
+    </w:p>
+    <w:p>
+      <w:pPr>
+        <w:rPr>
+          <w:b/>
+          <w:sz w:val="28"/>
+          <w:szCs w:val="28"/>
+          <w:lang w:val="en-IN"/>
+        </w:rPr>
+      </w:pPr>
+    </w:p>
+    <w:p>
+      <w:pPr>
+        <w:rPr>
+          <w:b/>
+          <w:sz w:val="28"/>
+          <w:szCs w:val="28"/>
+          <w:lang w:val="en-IN"/>
+        </w:rPr>
+      </w:pPr>
+    </w:p>
+    <w:p>
+      <w:pPr>
+        <w:rPr>
+          <w:b/>
+          <w:sz w:val="28"/>
+          <w:szCs w:val="28"/>
+          <w:lang w:val="en-IN"/>
+        </w:rPr>
+      </w:pPr>
+    </w:p>
+    <w:p>
+      <w:pPr>
+        <w:rPr>
+          <w:b/>
+          <w:sz w:val="28"/>
+          <w:szCs w:val="28"/>
+          <w:lang w:val="en-IN"/>
+        </w:rPr>
+      </w:pPr>
+    </w:p>
+    <w:p>
+      <w:pPr>
+        <w:rPr>
+          <w:b/>
+          <w:sz w:val="28"/>
+          <w:szCs w:val="28"/>
+          <w:lang w:val="en-IN"/>
+        </w:rPr>
+      </w:pPr>
+    </w:p>
+    <w:p>
+      <w:pPr>
+        <w:rPr>
+          <w:b/>
+          <w:sz w:val="28"/>
+          <w:szCs w:val="28"/>
+          <w:lang w:val="en-IN"/>
+        </w:rPr>
+      </w:pPr>
+    </w:p>
+    <w:p>
+      <w:pPr>
+        <w:rPr>
+          <w:b/>
+          <w:sz w:val="28"/>
+          <w:szCs w:val="28"/>
+          <w:lang w:val="en-IN"/>
+        </w:rPr>
+      </w:pPr>
+    </w:p>
+    <w:p>
+      <w:pPr>
+        <w:rPr>
+          <w:b/>
+          <w:sz w:val="28"/>
+          <w:szCs w:val="28"/>
+          <w:lang w:val="en-IN"/>
+        </w:rPr>
+      </w:pPr>
+    </w:p>
+    <w:p>
+      <w:pPr>
+        <w:jc w:val="center"/>
+        <w:rPr>
+          <w:b/>
+          <w:sz w:val="36"/>
+          <w:szCs w:val="36"/>
+          <w:lang w:val="en-IN"/>
+        </w:rPr>
+      </w:pPr>
+      <w:r>
+        <w:rPr>
+          <w:b/>
+          <w:sz w:val="36"/>
+          <w:szCs w:val="36"/>
+        </w:rPr>
+        <w:lastRenderedPageBreak/>
+        <w:t xml:space="preserve">EXPERIMENT </w:t>
+      </w:r>
+      <w:r>
+        <w:rPr>
+          <w:b/>
+          <w:sz w:val="36"/>
+          <w:szCs w:val="36"/>
+          <w:lang w:val="en-IN"/>
+        </w:rPr>
+        <w:t>8</w:t>
+      </w:r>
+    </w:p>
+    <w:p>
+      <w:pPr>
+        <w:jc w:val="center"/>
+        <w:rPr>
+          <w:b/>
+          <w:sz w:val="36"/>
+          <w:szCs w:val="36"/>
+          <w:lang w:val="en-IN"/>
+        </w:rPr>
+      </w:pPr>
+    </w:p>
+    <w:p>
+      <w:pPr>
+        <w:rPr>
+          <w:bCs/>
+          <w:sz w:val="28"/>
+          <w:szCs w:val="28"/>
+          <w:lang w:val="en-IN"/>
+        </w:rPr>
+      </w:pPr>
+      <w:r>
+        <w:rPr>
+          <w:b/>
+          <w:sz w:val="28"/>
+          <w:szCs w:val="28"/>
+        </w:rPr>
+        <w:t>AIM:</w:t>
+      </w:r>
+      <w:r>
+        <w:rPr>
+          <w:b/>
+          <w:sz w:val="28"/>
+          <w:szCs w:val="28"/>
+        </w:rPr>
+        <w:t xml:space="preserve"> </w:t>
+      </w:r>
+      <w:r>
+        <w:rPr>
+          <w:bCs/>
+          <w:sz w:val="28"/>
+          <w:szCs w:val="28"/>
+          <w:lang w:val="en-IN"/>
+        </w:rPr>
+        <w:t>Implement Gradient Boosting on a dataset and evaluate the model’s performance</w:t>
+      </w:r>
+    </w:p>
+    <w:p>
+      <w:pPr>
+        <w:rPr>
+          <w:b/>
+          <w:sz w:val="28"/>
+          <w:szCs w:val="28"/>
+          <w:lang w:val="en-IN"/>
+        </w:rPr>
+      </w:pPr>
+    </w:p>
+    <w:p>
+      <w:pPr>
+        <w:rPr>
+          <w:sz w:val="28"/>
+          <w:szCs w:val="28"/>
+        </w:rPr>
+      </w:pPr>
+      <w:r>
+        <w:rPr>
+          <w:b/>
+          <w:sz w:val="28"/>
+          <w:szCs w:val="28"/>
+        </w:rPr>
+        <w:t>THEORY:</w:t>
+      </w:r>
+      <w:r>
+        <w:rPr>
+          <w:b/>
+          <w:sz w:val="28"/>
+          <w:szCs w:val="28"/>
+        </w:rPr>
+        <w:t xml:space="preserve"> </w:t>
+      </w:r>
+      <w:r>
+        <w:rPr>
+          <w:sz w:val="28"/>
+          <w:szCs w:val="28"/>
+        </w:rPr>
+        <w:t xml:space="preserve">Gradient Boosting is an ensemble learning technique that constructs a strong model by combining multiple weak learners, typically decision trees, in a sequential manner. Each new tree in the sequence is trained to correct the errors made by the previous trees, allowing the model to improve gradually. This algorithm is highly effective because it can capture complex, nonlinear relationships between features and adaptively minimize prediction errors. The data is first cleaned by handling missing values in the “Age” and “Embarked” columns and converting categorical variables such as “Sex” and “Embarked” into numerical form using one-hot encoding. The dataset is then split into training and testing subsets to evaluate performance. The trained Gradient Boosting model provides metrics such as accuracy, confusion matrix, and classification report to assess how well it predicts survival. Additionally, the model reveals feature importance scores, </w:t>
+      </w:r>
+      <w:proofErr w:type="gramStart"/>
+      <w:r>
+        <w:rPr>
+          <w:sz w:val="28"/>
+          <w:szCs w:val="28"/>
+        </w:rPr>
+        <w:t>showing which variables</w:t>
+      </w:r>
+      <w:proofErr w:type="gramEnd"/>
+      <w:r>
+        <w:rPr>
+          <w:sz w:val="28"/>
+          <w:szCs w:val="28"/>
+        </w:rPr>
+        <w:t xml:space="preserve"> most influence the prediction — typically, “Sex,” “</w:t>
+      </w:r>
+      <w:proofErr w:type="spellStart"/>
+      <w:r>
+        <w:rPr>
+          <w:sz w:val="28"/>
+          <w:szCs w:val="28"/>
+        </w:rPr>
+        <w:t>Pclass</w:t>
+      </w:r>
+      <w:proofErr w:type="spellEnd"/>
+      <w:r>
+        <w:rPr>
+          <w:sz w:val="28"/>
+          <w:szCs w:val="28"/>
+        </w:rPr>
+        <w:t>,” and “Age” emerge as the most significant. Overall, this approach demonstrates how ensemble methods like Gradient Boosting can effectively learn from data to make accurate and interpretable predictions on real-world classification problems.</w:t>
+      </w:r>
+    </w:p>
+    <w:p>
+      <w:pPr>
+        <w:rPr>
+          <w:sz w:val="28"/>
+          <w:szCs w:val="28"/>
+        </w:rPr>
+      </w:pPr>
+    </w:p>
+    <w:p>
+      <w:pPr>
+        <w:rPr>
+          <w:b/>
+          <w:sz w:val="28"/>
+          <w:szCs w:val="28"/>
+        </w:rPr>
+      </w:pPr>
+      <w:r>
+        <w:rPr>
+          <w:b/>
+          <w:sz w:val="28"/>
+          <w:szCs w:val="28"/>
+        </w:rPr>
+        <w:t>ABOUT THE DATASET:</w:t>
+      </w:r>
+    </w:p>
+    <w:p>
+      <w:pPr>
+        <w:rPr>
+          <w:bCs/>
+          <w:sz w:val="28"/>
+          <w:szCs w:val="28"/>
+        </w:rPr>
+      </w:pPr>
+      <w:r>
+        <w:rPr>
+          <w:bCs/>
+          <w:sz w:val="28"/>
+          <w:szCs w:val="28"/>
+        </w:rPr>
+        <w:t>The Titanic dataset is one of the most well-known datasets in machine learning, containing information about passengers aboard the RMS Titanic, such as their age, sex, ticket class, number of family members on board, fare paid, and port of embarkation. The goal is to predict whether a passenger survived the disaster (1 = survived, 0 = did not survive) based on these attributes.</w:t>
+      </w:r>
+    </w:p>
+    <w:p>
+      <w:pPr>
+        <w:rPr>
+          <w:b/>
+          <w:sz w:val="28"/>
+          <w:szCs w:val="28"/>
+        </w:rPr>
+      </w:pPr>
+    </w:p>
+    <w:p>
+      <w:pPr>
+        <w:rPr>
+          <w:b/>
+          <w:sz w:val="28"/>
+          <w:szCs w:val="28"/>
+        </w:rPr>
+      </w:pPr>
+      <w:r>
+        <w:rPr>
+          <w:b/>
+          <w:sz w:val="28"/>
+          <w:szCs w:val="28"/>
+        </w:rPr>
+        <w:t>SOURCE CODE:</w:t>
+      </w:r>
+    </w:p>
+    <w:p>
+      <w:pPr>
+        <w:rPr>
+          <w:sz w:val="28"/>
+          <w:szCs w:val="28"/>
+        </w:rPr>
+      </w:pPr>
+      <w:r>
+        <w:rPr>
+          <w:sz w:val="28"/>
+          <w:szCs w:val="28"/>
+          <w:lang w:val="en-US"/>
+        </w:rPr>
+        <w:t># Import libraries</w:t>
+      </w:r>
+    </w:p>
+    <w:p>
+      <w:pPr>
+        <w:rPr>
+          <w:sz w:val="28"/>
+          <w:szCs w:val="28"/>
+        </w:rPr>
+      </w:pPr>
+      <w:r>
+        <w:rPr>
+          <w:sz w:val="28"/>
+          <w:szCs w:val="28"/>
+          <w:lang w:val="en-US"/>
+        </w:rPr>
+        <w:t>import pandas as pd</w:t>
+      </w:r>
+    </w:p>
+    <w:p>
+      <w:pPr>
+        <w:rPr>
+          <w:sz w:val="28"/>
+          <w:szCs w:val="28"/>
+        </w:rPr>
+      </w:pPr>
+      <w:r>
+        <w:rPr>
+          <w:sz w:val="28"/>
+          <w:szCs w:val="28"/>
+          <w:lang w:val="en-US"/>
+        </w:rPr>
+        <w:t xml:space="preserve">import </w:t>
+      </w:r>
+      <w:proofErr w:type="spellStart"/>
+      <w:r>
+        <w:rPr>
+          <w:sz w:val="28"/>
+          <w:szCs w:val="28"/>
+          <w:lang w:val="en-US"/>
+        </w:rPr>
+        <w:t>numpy</w:t>
+      </w:r>
+      <w:proofErr w:type="spellEnd"/>
+      <w:r>
+        <w:rPr>
+          <w:sz w:val="28"/>
+          <w:szCs w:val="28"/>
+          <w:lang w:val="en-US"/>
+        </w:rPr>
+        <w:t xml:space="preserve"> as np</w:t>
+      </w:r>
+    </w:p>
+    <w:p>
+      <w:pPr>
+        <w:rPr>
+          <w:sz w:val="28"/>
+          <w:szCs w:val="28"/>
+        </w:rPr>
+      </w:pPr>
+      <w:r>
+        <w:rPr>
+          <w:sz w:val="28"/>
+          <w:szCs w:val="28"/>
+          <w:lang w:val="en-US"/>
+        </w:rPr>
+        <w:t xml:space="preserve">from </w:t>
+      </w:r>
+      <w:proofErr w:type="spellStart"/>
+      <w:proofErr w:type="gramStart"/>
+      <w:r>
+        <w:rPr>
+          <w:sz w:val="28"/>
+          <w:szCs w:val="28"/>
+          <w:lang w:val="en-US"/>
+        </w:rPr>
+        <w:t>sklearn.model</w:t>
+      </w:r>
+      <w:proofErr w:type="gramEnd"/>
+      <w:r>
+        <w:rPr>
+          <w:sz w:val="28"/>
+          <w:szCs w:val="28"/>
+          <w:lang w:val="en-US"/>
+        </w:rPr>
+        <w:t>_selection</w:t>
+      </w:r>
+      <w:proofErr w:type="spellEnd"/>
+      <w:r>
+        <w:rPr>
+          <w:sz w:val="28"/>
+          <w:szCs w:val="28"/>
+          <w:lang w:val="en-US"/>
+        </w:rPr>
+        <w:t xml:space="preserve"> import </w:t>
+      </w:r>
+      <w:proofErr w:type="spellStart"/>
+      <w:r>
+        <w:rPr>
+          <w:sz w:val="28"/>
+          <w:szCs w:val="28"/>
+          <w:lang w:val="en-US"/>
+        </w:rPr>
+        <w:t>train_test_split</w:t>
+      </w:r>
+      <w:proofErr w:type="spellEnd"/>
+    </w:p>
+    <w:p>
+      <w:pPr>
+        <w:rPr>
+          <w:sz w:val="28"/>
+          <w:szCs w:val="28"/>
+        </w:rPr>
+      </w:pPr>
+      <w:r>
+        <w:rPr>
+          <w:sz w:val="28"/>
+          <w:szCs w:val="28"/>
+          <w:lang w:val="en-US"/>
+        </w:rPr>
+        <w:t xml:space="preserve">from </w:t>
+      </w:r>
+      <w:proofErr w:type="spellStart"/>
+      <w:proofErr w:type="gramStart"/>
+      <w:r>
+        <w:rPr>
+          <w:sz w:val="28"/>
+          <w:szCs w:val="28"/>
+          <w:lang w:val="en-US"/>
+        </w:rPr>
+        <w:t>sklearn.ensemble</w:t>
+      </w:r>
+      <w:proofErr w:type="spellEnd"/>
+      <w:proofErr w:type="gramEnd"/>
+      <w:r>
+        <w:rPr>
+          <w:sz w:val="28"/>
+          <w:szCs w:val="28"/>
+          <w:lang w:val="en-US"/>
+        </w:rPr>
+        <w:t xml:space="preserve"> import </w:t>
+      </w:r>
+      <w:proofErr w:type="spellStart"/>
+      <w:r>
+        <w:rPr>
+          <w:sz w:val="28"/>
+          <w:szCs w:val="28"/>
+          <w:lang w:val="en-US"/>
+        </w:rPr>
+        <w:t>GradientBoostingClassifier</w:t>
+      </w:r>
+      <w:proofErr w:type="spellEnd"/>
+    </w:p>
+    <w:p>
+      <w:pPr>
+        <w:rPr>
+          <w:sz w:val="28"/>
+          <w:szCs w:val="28"/>
+        </w:rPr>
+      </w:pPr>
+      <w:r>
+        <w:rPr>
+          <w:sz w:val="28"/>
+          <w:szCs w:val="28"/>
+          <w:lang w:val="en-US"/>
+        </w:rPr>
+        <w:t xml:space="preserve">from </w:t>
+      </w:r>
+      <w:proofErr w:type="spellStart"/>
+      <w:proofErr w:type="gramStart"/>
+      <w:r>
+        <w:rPr>
+          <w:sz w:val="28"/>
+          <w:szCs w:val="28"/>
+          <w:lang w:val="en-US"/>
+        </w:rPr>
+        <w:t>sklearn.metrics</w:t>
+      </w:r>
+      <w:proofErr w:type="spellEnd"/>
+      <w:proofErr w:type="gramEnd"/>
+      <w:r>
+        <w:rPr>
+          <w:sz w:val="28"/>
+          <w:szCs w:val="28"/>
+          <w:lang w:val="en-US"/>
+        </w:rPr>
+        <w:t xml:space="preserve"> import </w:t>
+      </w:r>
+      <w:proofErr w:type="spellStart"/>
+      <w:r>
+        <w:rPr>
+          <w:sz w:val="28"/>
+          <w:szCs w:val="28"/>
+          <w:lang w:val="en-US"/>
+        </w:rPr>
+        <w:t>accuracy_score</w:t>
+      </w:r>
+      <w:proofErr w:type="spellEnd"/>
+      <w:r>
+        <w:rPr>
+          <w:sz w:val="28"/>
+          <w:szCs w:val="28"/>
+          <w:lang w:val="en-US"/>
+        </w:rPr>
+        <w:t xml:space="preserve">, </w:t>
+      </w:r>
+      <w:proofErr w:type="spellStart"/>
+      <w:r>
+        <w:rPr>
+          <w:sz w:val="28"/>
+          <w:szCs w:val="28"/>
+          <w:lang w:val="en-US"/>
+        </w:rPr>
+        <w:t>confusion_matrix</w:t>
+      </w:r>
+      <w:proofErr w:type="spellEnd"/>
+      <w:r>
+        <w:rPr>
+          <w:sz w:val="28"/>
+          <w:szCs w:val="28"/>
+          <w:lang w:val="en-US"/>
+        </w:rPr>
+        <w:t xml:space="preserve">, </w:t>
+      </w:r>
+      <w:proofErr w:type="spellStart"/>
+      <w:r>
+        <w:rPr>
+          <w:sz w:val="28"/>
+          <w:szCs w:val="28"/>
+          <w:lang w:val="en-US"/>
+        </w:rPr>
+        <w:t>classification_report</w:t>
+      </w:r>
+      <w:proofErr w:type="spellEnd"/>
+    </w:p>
+    <w:p>
+      <w:pPr>
+        <w:rPr>
+          <w:sz w:val="28"/>
+          <w:szCs w:val="28"/>
+        </w:rPr>
+      </w:pPr>
+      <w:r>
+        <w:rPr>
+          <w:sz w:val="28"/>
+          <w:szCs w:val="28"/>
+          <w:lang w:val="en-US"/>
+        </w:rPr>
+        <w:t xml:space="preserve">import seaborn as </w:t>
+      </w:r>
+      <w:proofErr w:type="spellStart"/>
+      <w:r>
+        <w:rPr>
+          <w:sz w:val="28"/>
+          <w:szCs w:val="28"/>
+          <w:lang w:val="en-US"/>
+        </w:rPr>
+        <w:t>sns</w:t>
+      </w:r>
+      <w:proofErr w:type="spellEnd"/>
+    </w:p>
+    <w:p>
+      <w:pPr>
+        <w:rPr>
+          <w:sz w:val="28"/>
+          <w:szCs w:val="28"/>
+        </w:rPr>
+      </w:pPr>
+      <w:r>
+        <w:rPr>
+          <w:sz w:val="28"/>
+          <w:szCs w:val="28"/>
+          <w:lang w:val="en-US"/>
+        </w:rPr>
+        <w:t xml:space="preserve">import </w:t>
+      </w:r>
+      <w:proofErr w:type="spellStart"/>
+      <w:proofErr w:type="gramStart"/>
+      <w:r>
+        <w:rPr>
+          <w:sz w:val="28"/>
+          <w:szCs w:val="28"/>
+          <w:lang w:val="en-US"/>
+        </w:rPr>
+        <w:t>matplotlib.pyplot</w:t>
+      </w:r>
+      <w:proofErr w:type="spellEnd"/>
+      <w:proofErr w:type="gramEnd"/>
+      <w:r>
+        <w:rPr>
+          <w:sz w:val="28"/>
+          <w:szCs w:val="28"/>
+          <w:lang w:val="en-US"/>
+        </w:rPr>
+        <w:t xml:space="preserve"> as </w:t>
+      </w:r>
+      <w:proofErr w:type="spellStart"/>
+      <w:r>
+        <w:rPr>
+          <w:sz w:val="28"/>
+          <w:szCs w:val="28"/>
+          <w:lang w:val="en-US"/>
+        </w:rPr>
+        <w:t>plt</w:t>
+      </w:r>
+      <w:proofErr w:type="spellEnd"/>
+    </w:p>
+    <w:p>
+      <w:pPr>
+        <w:rPr>
+          <w:b/>
+          <w:bCs/>
+          <w:sz w:val="28"/>
+          <w:szCs w:val="28"/>
+        </w:rPr>
+      </w:pPr>
+      <w:r>
+        <w:rPr>
+          <w:b/>
+          <w:bCs/>
+          <w:sz w:val="28"/>
+          <w:szCs w:val="28"/>
+          <w:lang w:val="en-US"/>
+        </w:rPr>
+        <w:lastRenderedPageBreak/>
+        <w:t># Load the Titanic dataset</w:t>
+      </w:r>
+    </w:p>
+    <w:p>
+      <w:pPr>
+        <w:rPr>
+          <w:sz w:val="28"/>
+          <w:szCs w:val="28"/>
+        </w:rPr>
+      </w:pPr>
+      <w:proofErr w:type="spellStart"/>
+      <w:r>
+        <w:rPr>
+          <w:sz w:val="28"/>
+          <w:szCs w:val="28"/>
+          <w:lang w:val="en-US"/>
+        </w:rPr>
+        <w:t>url</w:t>
+      </w:r>
+      <w:proofErr w:type="spellEnd"/>
+      <w:r>
+        <w:rPr>
+          <w:sz w:val="28"/>
+          <w:szCs w:val="28"/>
+          <w:lang w:val="en-US"/>
+        </w:rPr>
+        <w:t xml:space="preserve"> = "https://raw.githubusercontent.com/datasciencedojo/datasets/master/titanic.csv"</w:t>
+      </w:r>
+    </w:p>
+    <w:p>
+      <w:pPr>
+        <w:rPr>
+          <w:sz w:val="28"/>
+          <w:szCs w:val="28"/>
+        </w:rPr>
+      </w:pPr>
+      <w:proofErr w:type="spellStart"/>
+      <w:r>
+        <w:rPr>
+          <w:sz w:val="28"/>
+          <w:szCs w:val="28"/>
+          <w:lang w:val="en-US"/>
+        </w:rPr>
+        <w:t>df</w:t>
+      </w:r>
+      <w:proofErr w:type="spellEnd"/>
+      <w:r>
+        <w:rPr>
+          <w:sz w:val="28"/>
+          <w:szCs w:val="28"/>
+          <w:lang w:val="en-US"/>
+        </w:rPr>
+        <w:t xml:space="preserve"> = </w:t>
+      </w:r>
+      <w:proofErr w:type="spellStart"/>
+      <w:proofErr w:type="gramStart"/>
+      <w:r>
+        <w:rPr>
+          <w:sz w:val="28"/>
+          <w:szCs w:val="28"/>
+          <w:lang w:val="en-US"/>
+        </w:rPr>
+        <w:t>pd.read</w:t>
+      </w:r>
+      <w:proofErr w:type="gramEnd"/>
+      <w:r>
+        <w:rPr>
+          <w:sz w:val="28"/>
+          <w:szCs w:val="28"/>
+          <w:lang w:val="en-US"/>
+        </w:rPr>
+        <w:t>_csv</w:t>
+      </w:r>
+      <w:proofErr w:type="spellEnd"/>
+      <w:r>
+        <w:rPr>
+          <w:sz w:val="28"/>
+          <w:szCs w:val="28"/>
+          <w:lang w:val="en-US"/>
+        </w:rPr>
+        <w:t>(</w:t>
+      </w:r>
+      <w:proofErr w:type="spellStart"/>
+      <w:r>
+        <w:rPr>
+          <w:sz w:val="28"/>
+          <w:szCs w:val="28"/>
+          <w:lang w:val="en-US"/>
+        </w:rPr>
+        <w:t>url</w:t>
+      </w:r>
+      <w:proofErr w:type="spellEnd"/>
+      <w:r>
+        <w:rPr>
+          <w:sz w:val="28"/>
+          <w:szCs w:val="28"/>
+          <w:lang w:val="en-US"/>
+        </w:rPr>
+        <w:t>)</w:t>
+      </w:r>
+    </w:p>
+    <w:p>
+      <w:pPr>
+        <w:rPr>
+          <w:sz w:val="28"/>
+          <w:szCs w:val="28"/>
+        </w:rPr>
+      </w:pPr>
+      <w:proofErr w:type="gramStart"/>
+      <w:r>
+        <w:rPr>
+          <w:sz w:val="28"/>
+          <w:szCs w:val="28"/>
+          <w:lang w:val="en-US"/>
+        </w:rPr>
+        <w:t>print(</w:t>
+      </w:r>
+      <w:proofErr w:type="gramEnd"/>
+      <w:r>
+        <w:rPr>
+          <w:sz w:val="28"/>
+          <w:szCs w:val="28"/>
+          <w:lang w:val="en-US"/>
+        </w:rPr>
+        <w:t xml:space="preserve">"Dataset shape:", </w:t>
+      </w:r>
+      <w:proofErr w:type="spellStart"/>
+      <w:proofErr w:type="gramStart"/>
+      <w:r>
+        <w:rPr>
+          <w:sz w:val="28"/>
+          <w:szCs w:val="28"/>
+          <w:lang w:val="en-US"/>
+        </w:rPr>
+        <w:t>df.shape</w:t>
+      </w:r>
+      <w:proofErr w:type="spellEnd"/>
+      <w:proofErr w:type="gramEnd"/>
+      <w:r>
+        <w:rPr>
+          <w:sz w:val="28"/>
+          <w:szCs w:val="28"/>
+          <w:lang w:val="en-US"/>
+        </w:rPr>
+        <w:t>)</w:t>
+      </w:r>
+    </w:p>
+    <w:p>
+      <w:pPr>
+        <w:rPr>
+          <w:sz w:val="28"/>
+          <w:szCs w:val="28"/>
+        </w:rPr>
+      </w:pPr>
+      <w:r>
+        <w:rPr>
+          <w:sz w:val="28"/>
+          <w:szCs w:val="28"/>
+          <w:lang w:val="en-US"/>
+        </w:rPr>
+        <w:t>print(</w:t>
+      </w:r>
+      <w:proofErr w:type="spellStart"/>
+      <w:proofErr w:type="gramStart"/>
+      <w:r>
+        <w:rPr>
+          <w:sz w:val="28"/>
+          <w:szCs w:val="28"/>
+          <w:lang w:val="en-US"/>
+        </w:rPr>
+        <w:t>df.head</w:t>
+      </w:r>
+      <w:proofErr w:type="spellEnd"/>
+      <w:proofErr w:type="gramEnd"/>
+      <w:r>
+        <w:rPr>
+          <w:sz w:val="28"/>
+          <w:szCs w:val="28"/>
+          <w:lang w:val="en-US"/>
+        </w:rPr>
+        <w:t>())</w:t>
+      </w:r>
+    </w:p>
+    <w:p>
+      <w:pPr>
+        <w:rPr>
+          <w:sz w:val="28"/>
+          <w:szCs w:val="28"/>
+        </w:rPr>
+      </w:pPr>
+      <w:r>
+        <w:rPr>
+          <w:sz w:val="28"/>
+          <w:szCs w:val="28"/>
+          <w:lang w:val="en-US"/>
+        </w:rPr>
+        <w:t># Select relevant features</w:t>
+      </w:r>
+    </w:p>
+    <w:p>
+      <w:pPr>
+        <w:rPr>
+          <w:sz w:val="28"/>
+          <w:szCs w:val="28"/>
+        </w:rPr>
+      </w:pPr>
+      <w:r>
+        <w:rPr>
+          <w:sz w:val="28"/>
+          <w:szCs w:val="28"/>
+          <w:lang w:val="en-US"/>
+        </w:rPr>
+        <w:t>features = ["</w:t>
+      </w:r>
+      <w:proofErr w:type="spellStart"/>
+      <w:r>
+        <w:rPr>
+          <w:sz w:val="28"/>
+          <w:szCs w:val="28"/>
+          <w:lang w:val="en-US"/>
+        </w:rPr>
+        <w:t>Pclass</w:t>
+      </w:r>
+      <w:proofErr w:type="spellEnd"/>
+      <w:r>
+        <w:rPr>
+          <w:sz w:val="28"/>
+          <w:szCs w:val="28"/>
+          <w:lang w:val="en-US"/>
+        </w:rPr>
+        <w:t>", "Sex", "Age", "</w:t>
+      </w:r>
+      <w:proofErr w:type="spellStart"/>
+      <w:r>
+        <w:rPr>
+          <w:sz w:val="28"/>
+          <w:szCs w:val="28"/>
+          <w:lang w:val="en-US"/>
+        </w:rPr>
+        <w:t>SibSp</w:t>
+      </w:r>
+      <w:proofErr w:type="spellEnd"/>
+      <w:r>
+        <w:rPr>
+          <w:sz w:val="28"/>
+          <w:szCs w:val="28"/>
+          <w:lang w:val="en-US"/>
+        </w:rPr>
+        <w:t>", "Parch", "Fare", "Embarked"]</w:t>
+      </w:r>
+    </w:p>
+    <w:p>
+      <w:pPr>
+        <w:rPr>
+          <w:sz w:val="28"/>
+          <w:szCs w:val="28"/>
+        </w:rPr>
+      </w:pPr>
+      <w:proofErr w:type="spellStart"/>
+      <w:r>
+        <w:rPr>
+          <w:sz w:val="28"/>
+          <w:szCs w:val="28"/>
+          <w:lang w:val="en-US"/>
+        </w:rPr>
+        <w:t>df</w:t>
+      </w:r>
+      <w:proofErr w:type="spellEnd"/>
+      <w:r>
+        <w:rPr>
+          <w:sz w:val="28"/>
+          <w:szCs w:val="28"/>
+          <w:lang w:val="en-US"/>
+        </w:rPr>
+        <w:t xml:space="preserve"> = </w:t>
+      </w:r>
+      <w:proofErr w:type="spellStart"/>
+      <w:proofErr w:type="gramStart"/>
+      <w:r>
+        <w:rPr>
+          <w:sz w:val="28"/>
+          <w:szCs w:val="28"/>
+          <w:lang w:val="en-US"/>
+        </w:rPr>
+        <w:t>df</w:t>
+      </w:r>
+      <w:proofErr w:type="spellEnd"/>
+      <w:r>
+        <w:rPr>
+          <w:sz w:val="28"/>
+          <w:szCs w:val="28"/>
+          <w:lang w:val="en-US"/>
+        </w:rPr>
+        <w:t>[</w:t>
+      </w:r>
+      <w:proofErr w:type="gramEnd"/>
+      <w:r>
+        <w:rPr>
+          <w:sz w:val="28"/>
+          <w:szCs w:val="28"/>
+          <w:lang w:val="en-US"/>
+        </w:rPr>
+        <w:t>features + ["Survived"]</w:t>
+      </w:r>
+      <w:proofErr w:type="gramStart"/>
+      <w:r>
+        <w:rPr>
+          <w:sz w:val="28"/>
+          <w:szCs w:val="28"/>
+          <w:lang w:val="en-US"/>
+        </w:rPr>
+        <w:t>].copy</w:t>
+      </w:r>
+      <w:proofErr w:type="gramEnd"/>
+      <w:r>
+        <w:rPr>
+          <w:sz w:val="28"/>
+          <w:szCs w:val="28"/>
+          <w:lang w:val="en-US"/>
+        </w:rPr>
+        <w:t>()</w:t>
+      </w:r>
+    </w:p>
+    <w:p>
+      <w:pPr>
+        <w:rPr>
+          <w:sz w:val="28"/>
+          <w:szCs w:val="28"/>
+        </w:rPr>
+      </w:pPr>
+      <w:r>
+        <w:rPr>
+          <w:sz w:val="28"/>
+          <w:szCs w:val="28"/>
+          <w:lang w:val="en-US"/>
+        </w:rPr>
+        <w:t># Handle missing values</w:t>
+      </w:r>
+    </w:p>
+    <w:p>
+      <w:pPr>
+        <w:rPr>
+          <w:sz w:val="28"/>
+          <w:szCs w:val="28"/>
+        </w:rPr>
+      </w:pPr>
+      <w:proofErr w:type="spellStart"/>
+      <w:r>
+        <w:rPr>
+          <w:sz w:val="28"/>
+          <w:szCs w:val="28"/>
+          <w:lang w:val="en-US"/>
+        </w:rPr>
+        <w:t>df</w:t>
+      </w:r>
+      <w:proofErr w:type="spellEnd"/>
+      <w:r>
+        <w:rPr>
+          <w:sz w:val="28"/>
+          <w:szCs w:val="28"/>
+          <w:lang w:val="en-US"/>
+        </w:rPr>
+        <w:t xml:space="preserve">["Age"] = </w:t>
+      </w:r>
+      <w:proofErr w:type="spellStart"/>
+      <w:r>
+        <w:rPr>
+          <w:sz w:val="28"/>
+          <w:szCs w:val="28"/>
+          <w:lang w:val="en-US"/>
+        </w:rPr>
+        <w:t>df</w:t>
+      </w:r>
+      <w:proofErr w:type="spellEnd"/>
+      <w:r>
+        <w:rPr>
+          <w:sz w:val="28"/>
+          <w:szCs w:val="28"/>
+          <w:lang w:val="en-US"/>
+        </w:rPr>
+        <w:t>["Age"</w:t>
+      </w:r>
+      <w:proofErr w:type="gramStart"/>
+      <w:r>
+        <w:rPr>
+          <w:sz w:val="28"/>
+          <w:szCs w:val="28"/>
+          <w:lang w:val="en-US"/>
+        </w:rPr>
+        <w:t>].</w:t>
+      </w:r>
+      <w:proofErr w:type="spellStart"/>
+      <w:r>
+        <w:rPr>
+          <w:sz w:val="28"/>
+          <w:szCs w:val="28"/>
+          <w:lang w:val="en-US"/>
+        </w:rPr>
+        <w:t>fillna</w:t>
+      </w:r>
+      <w:proofErr w:type="spellEnd"/>
+      <w:proofErr w:type="gramEnd"/>
+      <w:r>
+        <w:rPr>
+          <w:sz w:val="28"/>
+          <w:szCs w:val="28"/>
+          <w:lang w:val="en-US"/>
+        </w:rPr>
+        <w:t>(</w:t>
+      </w:r>
+      <w:proofErr w:type="spellStart"/>
+      <w:r>
+        <w:rPr>
+          <w:sz w:val="28"/>
+          <w:szCs w:val="28"/>
+          <w:lang w:val="en-US"/>
+        </w:rPr>
+        <w:t>df</w:t>
+      </w:r>
+      <w:proofErr w:type="spellEnd"/>
+      <w:r>
+        <w:rPr>
+          <w:sz w:val="28"/>
+          <w:szCs w:val="28"/>
+          <w:lang w:val="en-US"/>
+        </w:rPr>
+        <w:t>["Age"</w:t>
+      </w:r>
+      <w:proofErr w:type="gramStart"/>
+      <w:r>
+        <w:rPr>
+          <w:sz w:val="28"/>
+          <w:szCs w:val="28"/>
+          <w:lang w:val="en-US"/>
+        </w:rPr>
+        <w:t>].median</w:t>
+      </w:r>
+      <w:proofErr w:type="gramEnd"/>
+      <w:r>
+        <w:rPr>
+          <w:sz w:val="28"/>
+          <w:szCs w:val="28"/>
+          <w:lang w:val="en-US"/>
+        </w:rPr>
+        <w:t>())</w:t>
+      </w:r>
+    </w:p>
+    <w:p>
+      <w:pPr>
+        <w:rPr>
+          <w:sz w:val="28"/>
+          <w:szCs w:val="28"/>
+        </w:rPr>
+      </w:pPr>
+      <w:proofErr w:type="spellStart"/>
+      <w:r>
+        <w:rPr>
+          <w:sz w:val="28"/>
+          <w:szCs w:val="28"/>
+          <w:lang w:val="en-US"/>
+        </w:rPr>
+        <w:t>df</w:t>
+      </w:r>
+      <w:proofErr w:type="spellEnd"/>
+      <w:r>
+        <w:rPr>
+          <w:sz w:val="28"/>
+          <w:szCs w:val="28"/>
+          <w:lang w:val="en-US"/>
+        </w:rPr>
+        <w:t xml:space="preserve">["Embarked"] = </w:t>
+      </w:r>
+      <w:proofErr w:type="spellStart"/>
+      <w:r>
+        <w:rPr>
+          <w:sz w:val="28"/>
+          <w:szCs w:val="28"/>
+          <w:lang w:val="en-US"/>
+        </w:rPr>
+        <w:t>df</w:t>
+      </w:r>
+      <w:proofErr w:type="spellEnd"/>
+      <w:r>
+        <w:rPr>
+          <w:sz w:val="28"/>
+          <w:szCs w:val="28"/>
+          <w:lang w:val="en-US"/>
+        </w:rPr>
+        <w:t>["Embarked"</w:t>
+      </w:r>
+      <w:proofErr w:type="gramStart"/>
+      <w:r>
+        <w:rPr>
+          <w:sz w:val="28"/>
+          <w:szCs w:val="28"/>
+          <w:lang w:val="en-US"/>
+        </w:rPr>
+        <w:t>].</w:t>
+      </w:r>
+      <w:proofErr w:type="spellStart"/>
+      <w:r>
+        <w:rPr>
+          <w:sz w:val="28"/>
+          <w:szCs w:val="28"/>
+          <w:lang w:val="en-US"/>
+        </w:rPr>
+        <w:t>fillna</w:t>
+      </w:r>
+      <w:proofErr w:type="spellEnd"/>
+      <w:proofErr w:type="gramEnd"/>
+      <w:r>
+        <w:rPr>
+          <w:sz w:val="28"/>
+          <w:szCs w:val="28"/>
+          <w:lang w:val="en-US"/>
+        </w:rPr>
+        <w:t>(</w:t>
+      </w:r>
+      <w:proofErr w:type="spellStart"/>
+      <w:r>
+        <w:rPr>
+          <w:sz w:val="28"/>
+          <w:szCs w:val="28"/>
+          <w:lang w:val="en-US"/>
+        </w:rPr>
+        <w:t>df</w:t>
+      </w:r>
+      <w:proofErr w:type="spellEnd"/>
+      <w:r>
+        <w:rPr>
+          <w:sz w:val="28"/>
+          <w:szCs w:val="28"/>
+          <w:lang w:val="en-US"/>
+        </w:rPr>
+        <w:t>["Embarked"</w:t>
+      </w:r>
+      <w:proofErr w:type="gramStart"/>
+      <w:r>
+        <w:rPr>
+          <w:sz w:val="28"/>
+          <w:szCs w:val="28"/>
+          <w:lang w:val="en-US"/>
+        </w:rPr>
+        <w:t>].mode()[</w:t>
+      </w:r>
+      <w:proofErr w:type="gramEnd"/>
+      <w:r>
+        <w:rPr>
+          <w:sz w:val="28"/>
+          <w:szCs w:val="28"/>
+          <w:lang w:val="en-US"/>
+        </w:rPr>
+        <w:t>0])</w:t>
+      </w:r>
+    </w:p>
+    <w:p>
+      <w:pPr>
+        <w:rPr>
+          <w:sz w:val="28"/>
+          <w:szCs w:val="28"/>
+        </w:rPr>
+      </w:pPr>
+      <w:r>
+        <w:rPr>
+          <w:sz w:val="28"/>
+          <w:szCs w:val="28"/>
+          <w:lang w:val="en-US"/>
+        </w:rPr>
+        <w:t># Convert categorical variables into numeric</w:t>
+      </w:r>
+    </w:p>
+    <w:p>
+      <w:pPr>
+        <w:rPr>
+          <w:sz w:val="28"/>
+          <w:szCs w:val="28"/>
+        </w:rPr>
+      </w:pPr>
+      <w:proofErr w:type="spellStart"/>
+      <w:r>
+        <w:rPr>
+          <w:sz w:val="28"/>
+          <w:szCs w:val="28"/>
+          <w:lang w:val="en-US"/>
+        </w:rPr>
+        <w:t>df</w:t>
+      </w:r>
+      <w:proofErr w:type="spellEnd"/>
+      <w:r>
+        <w:rPr>
+          <w:sz w:val="28"/>
+          <w:szCs w:val="28"/>
+          <w:lang w:val="en-US"/>
+        </w:rPr>
+        <w:t xml:space="preserve"> = </w:t>
+      </w:r>
+      <w:proofErr w:type="spellStart"/>
+      <w:r>
+        <w:rPr>
+          <w:sz w:val="28"/>
+          <w:szCs w:val="28"/>
+          <w:lang w:val="en-US"/>
+        </w:rPr>
+        <w:t>pd.get_</w:t>
+      </w:r>
+      <w:proofErr w:type="gramStart"/>
+      <w:r>
+        <w:rPr>
+          <w:sz w:val="28"/>
+          <w:szCs w:val="28"/>
+          <w:lang w:val="en-US"/>
+        </w:rPr>
+        <w:t>dummies</w:t>
+      </w:r>
+      <w:proofErr w:type="spellEnd"/>
+      <w:r>
+        <w:rPr>
+          <w:sz w:val="28"/>
+          <w:szCs w:val="28"/>
+          <w:lang w:val="en-US"/>
+        </w:rPr>
+        <w:t>(</w:t>
+      </w:r>
+      <w:proofErr w:type="spellStart"/>
+      <w:proofErr w:type="gramEnd"/>
+      <w:r>
+        <w:rPr>
+          <w:sz w:val="28"/>
+          <w:szCs w:val="28"/>
+          <w:lang w:val="en-US"/>
+        </w:rPr>
+        <w:t>df</w:t>
+      </w:r>
+      <w:proofErr w:type="spellEnd"/>
+      <w:r>
+        <w:rPr>
+          <w:sz w:val="28"/>
+          <w:szCs w:val="28"/>
+          <w:lang w:val="en-US"/>
+        </w:rPr>
+        <w:t>, columns</w:t>
+      </w:r>
+      <w:proofErr w:type="gramStart"/>
+      <w:r>
+        <w:rPr>
+          <w:sz w:val="28"/>
+          <w:szCs w:val="28"/>
+          <w:lang w:val="en-US"/>
+        </w:rPr>
+        <w:t>=[</w:t>
+      </w:r>
+      <w:proofErr w:type="gramEnd"/>
+      <w:r>
+        <w:rPr>
+          <w:sz w:val="28"/>
+          <w:szCs w:val="28"/>
+          <w:lang w:val="en-US"/>
+        </w:rPr>
+        <w:t xml:space="preserve">"Sex", "Embarked"], </w:t>
+      </w:r>
+      <w:proofErr w:type="spellStart"/>
+      <w:r>
+        <w:rPr>
+          <w:sz w:val="28"/>
+          <w:szCs w:val="28"/>
+          <w:lang w:val="en-US"/>
+        </w:rPr>
+        <w:t>drop_first</w:t>
+      </w:r>
+      <w:proofErr w:type="spellEnd"/>
+      <w:r>
+        <w:rPr>
+          <w:sz w:val="28"/>
+          <w:szCs w:val="28"/>
+          <w:lang w:val="en-US"/>
+        </w:rPr>
+        <w:t>=True)</w:t>
+      </w:r>
+    </w:p>
+    <w:p>
+      <w:pPr>
+        <w:rPr>
+          <w:sz w:val="28"/>
+          <w:szCs w:val="28"/>
+        </w:rPr>
+      </w:pPr>
+      <w:r>
+        <w:rPr>
+          <w:sz w:val="28"/>
+          <w:szCs w:val="28"/>
+          <w:lang w:val="en-US"/>
+        </w:rPr>
+        <w:t># Split data into features (X) and target (y)</w:t>
+      </w:r>
+    </w:p>
+    <w:p>
+      <w:pPr>
+        <w:rPr>
+          <w:sz w:val="28"/>
+          <w:szCs w:val="28"/>
+        </w:rPr>
+      </w:pPr>
+      <w:r>
+        <w:rPr>
+          <w:sz w:val="28"/>
+          <w:szCs w:val="28"/>
+          <w:lang w:val="en-US"/>
+        </w:rPr>
+        <w:t xml:space="preserve">X = </w:t>
+      </w:r>
+      <w:proofErr w:type="spellStart"/>
+      <w:proofErr w:type="gramStart"/>
+      <w:r>
+        <w:rPr>
+          <w:sz w:val="28"/>
+          <w:szCs w:val="28"/>
+          <w:lang w:val="en-US"/>
+        </w:rPr>
+        <w:t>df.drop</w:t>
+      </w:r>
+      <w:proofErr w:type="spellEnd"/>
+      <w:proofErr w:type="gramEnd"/>
+      <w:r>
+        <w:rPr>
+          <w:sz w:val="28"/>
+          <w:szCs w:val="28"/>
+          <w:lang w:val="en-US"/>
+        </w:rPr>
+        <w:t>("Survived", axis=1)</w:t>
+      </w:r>
+    </w:p>
+    <w:p>
+      <w:pPr>
+        <w:rPr>
+          <w:sz w:val="28"/>
+          <w:szCs w:val="28"/>
+        </w:rPr>
+      </w:pPr>
+      <w:r>
+        <w:rPr>
+          <w:sz w:val="28"/>
+          <w:szCs w:val="28"/>
+          <w:lang w:val="en-US"/>
+        </w:rPr>
+        <w:t xml:space="preserve">y = </w:t>
+      </w:r>
+      <w:proofErr w:type="spellStart"/>
+      <w:r>
+        <w:rPr>
+          <w:sz w:val="28"/>
+          <w:szCs w:val="28"/>
+          <w:lang w:val="en-US"/>
+        </w:rPr>
+        <w:t>df</w:t>
+      </w:r>
+      <w:proofErr w:type="spellEnd"/>
+      <w:r>
+        <w:rPr>
+          <w:sz w:val="28"/>
+          <w:szCs w:val="28"/>
+          <w:lang w:val="en-US"/>
+        </w:rPr>
+        <w:t>["Survived"]</w:t>
+      </w:r>
+    </w:p>
+    <w:p>
+      <w:pPr>
+        <w:rPr>
+          <w:sz w:val="28"/>
+          <w:szCs w:val="28"/>
+        </w:rPr>
+      </w:pPr>
+      <w:r>
+        <w:rPr>
+          <w:sz w:val="28"/>
+          <w:szCs w:val="28"/>
+          <w:lang w:val="en-US"/>
+        </w:rPr>
+        <w:t># Split into training and test sets</w:t>
+      </w:r>
+    </w:p>
+    <w:p>
+      <w:pPr>
+        <w:rPr>
+          <w:sz w:val="28"/>
+          <w:szCs w:val="28"/>
+        </w:rPr>
+      </w:pPr>
+      <w:proofErr w:type="spellStart"/>
+      <w:r>
+        <w:rPr>
+          <w:sz w:val="28"/>
+          <w:szCs w:val="28"/>
+          <w:lang w:val="en-US"/>
+        </w:rPr>
+        <w:t>X_train</w:t>
+      </w:r>
+      <w:proofErr w:type="spellEnd"/>
+      <w:r>
+        <w:rPr>
+          <w:sz w:val="28"/>
+          <w:szCs w:val="28"/>
+          <w:lang w:val="en-US"/>
+        </w:rPr>
+        <w:t xml:space="preserve">, </w:t>
+      </w:r>
+      <w:proofErr w:type="spellStart"/>
+      <w:r>
+        <w:rPr>
+          <w:sz w:val="28"/>
+          <w:szCs w:val="28"/>
+          <w:lang w:val="en-US"/>
+        </w:rPr>
+        <w:t>X_test</w:t>
+      </w:r>
+      <w:proofErr w:type="spellEnd"/>
+      <w:r>
+        <w:rPr>
+          <w:sz w:val="28"/>
+          <w:szCs w:val="28"/>
+          <w:lang w:val="en-US"/>
+        </w:rPr>
+        <w:t xml:space="preserve">, </w:t>
+      </w:r>
+      <w:proofErr w:type="spellStart"/>
+      <w:r>
+        <w:rPr>
+          <w:sz w:val="28"/>
+          <w:szCs w:val="28"/>
+          <w:lang w:val="en-US"/>
+        </w:rPr>
+        <w:t>y_train</w:t>
+      </w:r>
+      <w:proofErr w:type="spellEnd"/>
+      <w:r>
+        <w:rPr>
+          <w:sz w:val="28"/>
+          <w:szCs w:val="28"/>
+          <w:lang w:val="en-US"/>
+        </w:rPr>
+        <w:t xml:space="preserve">, </w:t>
+      </w:r>
+      <w:proofErr w:type="spellStart"/>
+      <w:r>
+        <w:rPr>
+          <w:sz w:val="28"/>
+          <w:szCs w:val="28"/>
+          <w:lang w:val="en-US"/>
+        </w:rPr>
+        <w:t>y_test</w:t>
+      </w:r>
+      <w:proofErr w:type="spellEnd"/>
+      <w:r>
+        <w:rPr>
+          <w:sz w:val="28"/>
+          <w:szCs w:val="28"/>
+          <w:lang w:val="en-US"/>
+        </w:rPr>
+        <w:t xml:space="preserve"> = </w:t>
+      </w:r>
+      <w:proofErr w:type="spellStart"/>
+      <w:r>
+        <w:rPr>
+          <w:sz w:val="28"/>
+          <w:szCs w:val="28"/>
+          <w:lang w:val="en-US"/>
+        </w:rPr>
+        <w:t>train_test_</w:t>
+      </w:r>
+      <w:proofErr w:type="gramStart"/>
+      <w:r>
+        <w:rPr>
+          <w:sz w:val="28"/>
+          <w:szCs w:val="28"/>
+          <w:lang w:val="en-US"/>
+        </w:rPr>
+        <w:t>split</w:t>
+      </w:r>
+      <w:proofErr w:type="spellEnd"/>
+      <w:r>
+        <w:rPr>
+          <w:sz w:val="28"/>
+          <w:szCs w:val="28"/>
+          <w:lang w:val="en-US"/>
+        </w:rPr>
+        <w:t>(</w:t>
+      </w:r>
+      <w:proofErr w:type="gramEnd"/>
+    </w:p>
+    <w:p>
+      <w:pPr>
+        <w:rPr>
+          <w:sz w:val="28"/>
+          <w:szCs w:val="28"/>
+        </w:rPr>
+      </w:pPr>
+      <w:r>
+        <w:rPr>
+          <w:sz w:val="28"/>
+          <w:szCs w:val="28"/>
+          <w:lang w:val="en-US"/>
+        </w:rPr>
+        <w:t xml:space="preserve">    X, y, </w:t>
+      </w:r>
+      <w:proofErr w:type="spellStart"/>
+      <w:r>
+        <w:rPr>
+          <w:sz w:val="28"/>
+          <w:szCs w:val="28"/>
+          <w:lang w:val="en-US"/>
+        </w:rPr>
+        <w:t>test_size</w:t>
+      </w:r>
+      <w:proofErr w:type="spellEnd"/>
+      <w:r>
+        <w:rPr>
+          <w:sz w:val="28"/>
+          <w:szCs w:val="28"/>
+          <w:lang w:val="en-US"/>
+        </w:rPr>
+        <w:t xml:space="preserve">=0.2, </w:t>
+      </w:r>
+      <w:proofErr w:type="spellStart"/>
+      <w:r>
+        <w:rPr>
+          <w:sz w:val="28"/>
+          <w:szCs w:val="28"/>
+          <w:lang w:val="en-US"/>
+        </w:rPr>
+        <w:t>random_state</w:t>
+      </w:r>
+      <w:proofErr w:type="spellEnd"/>
+      <w:r>
+        <w:rPr>
+          <w:sz w:val="28"/>
+          <w:szCs w:val="28"/>
+          <w:lang w:val="en-US"/>
+        </w:rPr>
+        <w:t>=42</w:t>
+      </w:r>
+    </w:p>
+    <w:p>
+      <w:pPr>
+        <w:rPr>
+          <w:sz w:val="28"/>
+          <w:szCs w:val="28"/>
+          <w:lang w:val="en-US"/>
+        </w:rPr>
+      </w:pPr>
+      <w:r>
+        <w:rPr>
+          <w:sz w:val="28"/>
+          <w:szCs w:val="28"/>
+          <w:lang w:val="en-US"/>
+        </w:rPr>
+        <w:t>)</w:t>
+      </w:r>
+    </w:p>
+    <w:p>
+      <w:pPr>
+        <w:rPr>
+          <w:sz w:val="28"/>
+          <w:szCs w:val="28"/>
+        </w:rPr>
+      </w:pPr>
+    </w:p>
+    <w:p>
+      <w:pPr>
+        <w:rPr>
+          <w:sz w:val="28"/>
+          <w:szCs w:val="28"/>
+        </w:rPr>
+      </w:pPr>
+      <w:r>
+        <w:rPr>
+          <w:sz w:val="28"/>
+          <w:szCs w:val="28"/>
+          <w:lang w:val="en-US"/>
+        </w:rPr>
+        <w:t># Create and train the Gradient Boosting model</w:t>
+      </w:r>
+    </w:p>
+    <w:p>
+      <w:pPr>
+        <w:rPr>
+          <w:sz w:val="28"/>
+          <w:szCs w:val="28"/>
+        </w:rPr>
+      </w:pPr>
+      <w:r>
+        <w:rPr>
+          <w:sz w:val="28"/>
+          <w:szCs w:val="28"/>
+          <w:lang w:val="en-US"/>
+        </w:rPr>
+        <w:t xml:space="preserve">model = </w:t>
+      </w:r>
+      <w:proofErr w:type="spellStart"/>
+      <w:r>
+        <w:rPr>
+          <w:sz w:val="28"/>
+          <w:szCs w:val="28"/>
+          <w:lang w:val="en-US"/>
+        </w:rPr>
+        <w:t>GradientBoostingClassifier</w:t>
+      </w:r>
+      <w:proofErr w:type="spellEnd"/>
+      <w:r>
+        <w:rPr>
+          <w:sz w:val="28"/>
+          <w:szCs w:val="28"/>
+          <w:lang w:val="en-US"/>
+        </w:rPr>
+        <w:t>(</w:t>
+      </w:r>
+      <w:proofErr w:type="spellStart"/>
+      <w:r>
+        <w:rPr>
+          <w:sz w:val="28"/>
+          <w:szCs w:val="28"/>
+          <w:lang w:val="en-US"/>
+        </w:rPr>
+        <w:t>random_state</w:t>
+      </w:r>
+      <w:proofErr w:type="spellEnd"/>
+      <w:r>
+        <w:rPr>
+          <w:sz w:val="28"/>
+          <w:szCs w:val="28"/>
+          <w:lang w:val="en-US"/>
+        </w:rPr>
+        <w:t>=42)</w:t>
+      </w:r>
+    </w:p>
+    <w:p>
+      <w:pPr>
+        <w:rPr>
+          <w:sz w:val="28"/>
+          <w:szCs w:val="28"/>
+        </w:rPr>
+      </w:pPr>
+      <w:proofErr w:type="spellStart"/>
+      <w:proofErr w:type="gramStart"/>
+      <w:r>
+        <w:rPr>
+          <w:sz w:val="28"/>
+          <w:szCs w:val="28"/>
+          <w:lang w:val="en-US"/>
+        </w:rPr>
+        <w:t>model.fit</w:t>
+      </w:r>
+      <w:proofErr w:type="spellEnd"/>
+      <w:r>
+        <w:rPr>
+          <w:sz w:val="28"/>
+          <w:szCs w:val="28"/>
+          <w:lang w:val="en-US"/>
+        </w:rPr>
+        <w:t>(</w:t>
+      </w:r>
+      <w:proofErr w:type="spellStart"/>
+      <w:proofErr w:type="gramEnd"/>
+      <w:r>
+        <w:rPr>
+          <w:sz w:val="28"/>
+          <w:szCs w:val="28"/>
+          <w:lang w:val="en-US"/>
+        </w:rPr>
+        <w:t>X_train</w:t>
+      </w:r>
+      <w:proofErr w:type="spellEnd"/>
+      <w:r>
+        <w:rPr>
+          <w:sz w:val="28"/>
+          <w:szCs w:val="28"/>
+          <w:lang w:val="en-US"/>
+        </w:rPr>
+        <w:t xml:space="preserve">, </w:t>
+      </w:r>
+      <w:proofErr w:type="spellStart"/>
+      <w:r>
+        <w:rPr>
+          <w:sz w:val="28"/>
+          <w:szCs w:val="28"/>
+          <w:lang w:val="en-US"/>
+        </w:rPr>
+        <w:t>y_train</w:t>
+      </w:r>
+      <w:proofErr w:type="spellEnd"/>
+      <w:r>
+        <w:rPr>
+          <w:sz w:val="28"/>
+          <w:szCs w:val="28"/>
+          <w:lang w:val="en-US"/>
+        </w:rPr>
+        <w:t>)</w:t>
+      </w:r>
+    </w:p>
+    <w:p>
+      <w:pPr>
+        <w:rPr>
+          <w:sz w:val="28"/>
+          <w:szCs w:val="28"/>
+        </w:rPr>
+      </w:pPr>
+      <w:r>
+        <w:rPr>
+          <w:sz w:val="28"/>
+          <w:szCs w:val="28"/>
+          <w:lang w:val="en-US"/>
+        </w:rPr>
+        <w:t># Make predictions</w:t>
+      </w:r>
+    </w:p>
+    <w:p>
+      <w:pPr>
+        <w:rPr>
+          <w:sz w:val="28"/>
+          <w:szCs w:val="28"/>
+        </w:rPr>
+      </w:pPr>
+      <w:proofErr w:type="spellStart"/>
+      <w:r>
+        <w:rPr>
+          <w:sz w:val="28"/>
+          <w:szCs w:val="28"/>
+          <w:lang w:val="en-US"/>
+        </w:rPr>
+        <w:t>y_pred</w:t>
+      </w:r>
+      <w:proofErr w:type="spellEnd"/>
+      <w:r>
+        <w:rPr>
+          <w:sz w:val="28"/>
+          <w:szCs w:val="28"/>
+          <w:lang w:val="en-US"/>
+        </w:rPr>
+        <w:t xml:space="preserve"> = </w:t>
+      </w:r>
+      <w:proofErr w:type="spellStart"/>
+      <w:proofErr w:type="gramStart"/>
+      <w:r>
+        <w:rPr>
+          <w:sz w:val="28"/>
+          <w:szCs w:val="28"/>
+          <w:lang w:val="en-US"/>
+        </w:rPr>
+        <w:t>model.predict</w:t>
+      </w:r>
+      <w:proofErr w:type="spellEnd"/>
+      <w:proofErr w:type="gramEnd"/>
+      <w:r>
+        <w:rPr>
+          <w:sz w:val="28"/>
+          <w:szCs w:val="28"/>
+          <w:lang w:val="en-US"/>
+        </w:rPr>
+        <w:t>(</w:t>
+      </w:r>
+      <w:proofErr w:type="spellStart"/>
+      <w:r>
+        <w:rPr>
+          <w:sz w:val="28"/>
+          <w:szCs w:val="28"/>
+          <w:lang w:val="en-US"/>
+        </w:rPr>
+        <w:t>X_test</w:t>
+      </w:r>
+      <w:proofErr w:type="spellEnd"/>
+      <w:r>
+        <w:rPr>
+          <w:sz w:val="28"/>
+          <w:szCs w:val="28"/>
+          <w:lang w:val="en-US"/>
+        </w:rPr>
+        <w:t>)</w:t>
+      </w:r>
+    </w:p>
+    <w:p>
+      <w:pPr>
+        <w:rPr>
+          <w:sz w:val="28"/>
+          <w:szCs w:val="28"/>
+        </w:rPr>
+      </w:pPr>
+      <w:r>
+        <w:rPr>
+          <w:sz w:val="28"/>
+          <w:szCs w:val="28"/>
+          <w:lang w:val="en-US"/>
+        </w:rPr>
+        <w:t># Evaluate the model</w:t>
+      </w:r>
+    </w:p>
+    <w:p>
+      <w:pPr>
+        <w:rPr>
+          <w:sz w:val="28"/>
+          <w:szCs w:val="28"/>
+        </w:rPr>
+      </w:pPr>
+      <w:proofErr w:type="gramStart"/>
+      <w:r>
+        <w:rPr>
+          <w:sz w:val="28"/>
+          <w:szCs w:val="28"/>
+          <w:lang w:val="en-US"/>
+        </w:rPr>
+        <w:t>print(</w:t>
+      </w:r>
+      <w:proofErr w:type="gramEnd"/>
+      <w:r>
+        <w:rPr>
+          <w:sz w:val="28"/>
+          <w:szCs w:val="28"/>
+          <w:lang w:val="en-US"/>
+        </w:rPr>
+        <w:t>"\</w:t>
+      </w:r>
+      <w:proofErr w:type="spellStart"/>
+      <w:r>
+        <w:rPr>
+          <w:sz w:val="28"/>
+          <w:szCs w:val="28"/>
+          <w:lang w:val="en-US"/>
+        </w:rPr>
+        <w:t>nModel</w:t>
+      </w:r>
+      <w:proofErr w:type="spellEnd"/>
+      <w:r>
+        <w:rPr>
+          <w:sz w:val="28"/>
+          <w:szCs w:val="28"/>
+          <w:lang w:val="en-US"/>
+        </w:rPr>
+        <w:t xml:space="preserve"> Evaluation:")</w:t>
+      </w:r>
+    </w:p>
+    <w:p>
+      <w:pPr>
+        <w:rPr>
+          <w:sz w:val="28"/>
+          <w:szCs w:val="28"/>
+        </w:rPr>
+      </w:pPr>
+      <w:proofErr w:type="gramStart"/>
+      <w:r>
+        <w:rPr>
+          <w:sz w:val="28"/>
+          <w:szCs w:val="28"/>
+          <w:lang w:val="en-US"/>
+        </w:rPr>
+        <w:t>print(</w:t>
+      </w:r>
+      <w:proofErr w:type="gramEnd"/>
+      <w:r>
+        <w:rPr>
+          <w:sz w:val="28"/>
+          <w:szCs w:val="28"/>
+          <w:lang w:val="en-US"/>
+        </w:rPr>
+        <w:t>"-----------------")</w:t>
+      </w:r>
+    </w:p>
+    <w:p>
+      <w:pPr>
+        <w:rPr>
+          <w:sz w:val="28"/>
+          <w:szCs w:val="28"/>
+        </w:rPr>
+      </w:pPr>
+      <w:proofErr w:type="gramStart"/>
+      <w:r>
+        <w:rPr>
+          <w:sz w:val="28"/>
+          <w:szCs w:val="28"/>
+          <w:lang w:val="en-US"/>
+        </w:rPr>
+        <w:t>print(</w:t>
+      </w:r>
+      <w:proofErr w:type="gramEnd"/>
+      <w:r>
+        <w:rPr>
+          <w:sz w:val="28"/>
+          <w:szCs w:val="28"/>
+          <w:lang w:val="en-US"/>
+        </w:rPr>
+        <w:t xml:space="preserve">"Accuracy:", </w:t>
+      </w:r>
+      <w:proofErr w:type="spellStart"/>
+      <w:r>
+        <w:rPr>
+          <w:sz w:val="28"/>
+          <w:szCs w:val="28"/>
+          <w:lang w:val="en-US"/>
+        </w:rPr>
+        <w:t>accuracy_</w:t>
+      </w:r>
+      <w:proofErr w:type="gramStart"/>
+      <w:r>
+        <w:rPr>
+          <w:sz w:val="28"/>
+          <w:szCs w:val="28"/>
+          <w:lang w:val="en-US"/>
+        </w:rPr>
+        <w:t>score</w:t>
+      </w:r>
+      <w:proofErr w:type="spellEnd"/>
+      <w:r>
+        <w:rPr>
+          <w:sz w:val="28"/>
+          <w:szCs w:val="28"/>
+          <w:lang w:val="en-US"/>
+        </w:rPr>
+        <w:t>(</w:t>
+      </w:r>
+      <w:proofErr w:type="spellStart"/>
+      <w:proofErr w:type="gramEnd"/>
+      <w:r>
+        <w:rPr>
+          <w:sz w:val="28"/>
+          <w:szCs w:val="28"/>
+          <w:lang w:val="en-US"/>
+        </w:rPr>
+        <w:t>y_test</w:t>
+      </w:r>
+      <w:proofErr w:type="spellEnd"/>
+      <w:r>
+        <w:rPr>
+          <w:sz w:val="28"/>
+          <w:szCs w:val="28"/>
+          <w:lang w:val="en-US"/>
+        </w:rPr>
+        <w:t xml:space="preserve">, </w:t>
+      </w:r>
+      <w:proofErr w:type="spellStart"/>
+      <w:r>
+        <w:rPr>
+          <w:sz w:val="28"/>
+          <w:szCs w:val="28"/>
+          <w:lang w:val="en-US"/>
+        </w:rPr>
+        <w:t>y_pred</w:t>
+      </w:r>
+      <w:proofErr w:type="spellEnd"/>
+      <w:r>
+        <w:rPr>
+          <w:sz w:val="28"/>
+          <w:szCs w:val="28"/>
+          <w:lang w:val="en-US"/>
+        </w:rPr>
+        <w:t>))</w:t>
+      </w:r>
+    </w:p>
+    <w:p>
+      <w:pPr>
+        <w:rPr>
+          <w:sz w:val="28"/>
+          <w:szCs w:val="28"/>
+        </w:rPr>
+      </w:pPr>
+      <w:proofErr w:type="gramStart"/>
+      <w:r>
+        <w:rPr>
+          <w:sz w:val="28"/>
+          <w:szCs w:val="28"/>
+          <w:lang w:val="en-US"/>
+        </w:rPr>
+        <w:t>print(</w:t>
+      </w:r>
+      <w:proofErr w:type="gramEnd"/>
+      <w:r>
+        <w:rPr>
+          <w:sz w:val="28"/>
+          <w:szCs w:val="28"/>
+          <w:lang w:val="en-US"/>
+        </w:rPr>
+        <w:t>"\</w:t>
+      </w:r>
+      <w:proofErr w:type="spellStart"/>
+      <w:r>
+        <w:rPr>
+          <w:sz w:val="28"/>
+          <w:szCs w:val="28"/>
+          <w:lang w:val="en-US"/>
+        </w:rPr>
+        <w:t>nClassification</w:t>
+      </w:r>
+      <w:proofErr w:type="spellEnd"/>
+      <w:r>
+        <w:rPr>
+          <w:sz w:val="28"/>
+          <w:szCs w:val="28"/>
+          <w:lang w:val="en-US"/>
+        </w:rPr>
+        <w:t xml:space="preserve"> Report:\n", </w:t>
+      </w:r>
+      <w:proofErr w:type="spellStart"/>
+      <w:r>
+        <w:rPr>
+          <w:sz w:val="28"/>
+          <w:szCs w:val="28"/>
+          <w:lang w:val="en-US"/>
+        </w:rPr>
+        <w:t>classification_</w:t>
+      </w:r>
+      <w:proofErr w:type="gramStart"/>
+      <w:r>
+        <w:rPr>
+          <w:sz w:val="28"/>
+          <w:szCs w:val="28"/>
+          <w:lang w:val="en-US"/>
+        </w:rPr>
+        <w:t>report</w:t>
+      </w:r>
+      <w:proofErr w:type="spellEnd"/>
+      <w:r>
+        <w:rPr>
+          <w:sz w:val="28"/>
+          <w:szCs w:val="28"/>
+          <w:lang w:val="en-US"/>
+        </w:rPr>
+        <w:t>(</w:t>
+      </w:r>
+      <w:proofErr w:type="spellStart"/>
+      <w:proofErr w:type="gramEnd"/>
+      <w:r>
+        <w:rPr>
+          <w:sz w:val="28"/>
+          <w:szCs w:val="28"/>
+          <w:lang w:val="en-US"/>
+        </w:rPr>
+        <w:t>y_test</w:t>
+      </w:r>
+      <w:proofErr w:type="spellEnd"/>
+      <w:r>
+        <w:rPr>
+          <w:sz w:val="28"/>
+          <w:szCs w:val="28"/>
+          <w:lang w:val="en-US"/>
+        </w:rPr>
+        <w:t xml:space="preserve">, </w:t>
+      </w:r>
+      <w:proofErr w:type="spellStart"/>
+      <w:r>
+        <w:rPr>
+          <w:sz w:val="28"/>
+          <w:szCs w:val="28"/>
+          <w:lang w:val="en-US"/>
+        </w:rPr>
+        <w:t>y_pred</w:t>
+      </w:r>
+      <w:proofErr w:type="spellEnd"/>
+      <w:r>
+        <w:rPr>
+          <w:sz w:val="28"/>
+          <w:szCs w:val="28"/>
+          <w:lang w:val="en-US"/>
+        </w:rPr>
+        <w:t>))</w:t>
+      </w:r>
+    </w:p>
+    <w:p>
+      <w:pPr>
+        <w:rPr>
+          <w:sz w:val="28"/>
+          <w:szCs w:val="28"/>
+        </w:rPr>
+      </w:pPr>
+      <w:r>
+        <w:rPr>
+          <w:sz w:val="28"/>
+          <w:szCs w:val="28"/>
+          <w:lang w:val="en-US"/>
+        </w:rPr>
+        <w:t># Confusion matrix</w:t>
+      </w:r>
+    </w:p>
+    <w:p>
+      <w:pPr>
+        <w:rPr>
+          <w:sz w:val="28"/>
+          <w:szCs w:val="28"/>
+        </w:rPr>
+      </w:pPr>
+      <w:r>
+        <w:rPr>
+          <w:sz w:val="28"/>
+          <w:szCs w:val="28"/>
+          <w:lang w:val="en-US"/>
+        </w:rPr>
+        <w:t xml:space="preserve">cm = </w:t>
+      </w:r>
+      <w:proofErr w:type="spellStart"/>
+      <w:r>
+        <w:rPr>
+          <w:sz w:val="28"/>
+          <w:szCs w:val="28"/>
+          <w:lang w:val="en-US"/>
+        </w:rPr>
+        <w:t>confusion_</w:t>
+      </w:r>
+      <w:proofErr w:type="gramStart"/>
+      <w:r>
+        <w:rPr>
+          <w:sz w:val="28"/>
+          <w:szCs w:val="28"/>
+          <w:lang w:val="en-US"/>
+        </w:rPr>
+        <w:t>matrix</w:t>
+      </w:r>
+      <w:proofErr w:type="spellEnd"/>
+      <w:r>
+        <w:rPr>
+          <w:sz w:val="28"/>
+          <w:szCs w:val="28"/>
+          <w:lang w:val="en-US"/>
+        </w:rPr>
+        <w:t>(</w:t>
+      </w:r>
+      <w:proofErr w:type="spellStart"/>
+      <w:proofErr w:type="gramEnd"/>
+      <w:r>
+        <w:rPr>
+          <w:sz w:val="28"/>
+          <w:szCs w:val="28"/>
+          <w:lang w:val="en-US"/>
+        </w:rPr>
+        <w:t>y_test</w:t>
+      </w:r>
+      <w:proofErr w:type="spellEnd"/>
+      <w:r>
+        <w:rPr>
+          <w:sz w:val="28"/>
+          <w:szCs w:val="28"/>
+          <w:lang w:val="en-US"/>
+        </w:rPr>
+        <w:t xml:space="preserve">, </w:t>
+      </w:r>
+      <w:proofErr w:type="spellStart"/>
+      <w:r>
+        <w:rPr>
+          <w:sz w:val="28"/>
+          <w:szCs w:val="28"/>
+          <w:lang w:val="en-US"/>
+        </w:rPr>
+        <w:t>y_pred</w:t>
+      </w:r>
+      <w:proofErr w:type="spellEnd"/>
+      <w:r>
+        <w:rPr>
+          <w:sz w:val="28"/>
+          <w:szCs w:val="28"/>
+          <w:lang w:val="en-US"/>
+        </w:rPr>
+        <w:t>)</w:t>
+      </w:r>
+    </w:p>
+    <w:p>
+      <w:pPr>
+        <w:rPr>
+          <w:sz w:val="28"/>
+          <w:szCs w:val="28"/>
+        </w:rPr>
+      </w:pPr>
+      <w:proofErr w:type="spellStart"/>
+      <w:proofErr w:type="gramStart"/>
+      <w:r>
+        <w:rPr>
+          <w:sz w:val="28"/>
+          <w:szCs w:val="28"/>
+          <w:lang w:val="en-US"/>
+        </w:rPr>
+        <w:t>plt.figure</w:t>
+      </w:r>
+      <w:proofErr w:type="spellEnd"/>
+      <w:proofErr w:type="gramEnd"/>
+      <w:r>
+        <w:rPr>
+          <w:sz w:val="28"/>
+          <w:szCs w:val="28"/>
+          <w:lang w:val="en-US"/>
+        </w:rPr>
+        <w:t>(</w:t>
+      </w:r>
+      <w:proofErr w:type="spellStart"/>
+      <w:r>
+        <w:rPr>
+          <w:sz w:val="28"/>
+          <w:szCs w:val="28"/>
+          <w:lang w:val="en-US"/>
+        </w:rPr>
+        <w:t>figsize</w:t>
+      </w:r>
+      <w:proofErr w:type="spellEnd"/>
+      <w:proofErr w:type="gramStart"/>
+      <w:r>
+        <w:rPr>
+          <w:sz w:val="28"/>
+          <w:szCs w:val="28"/>
+          <w:lang w:val="en-US"/>
+        </w:rPr>
+        <w:t>=(</w:t>
+      </w:r>
+      <w:proofErr w:type="gramEnd"/>
+      <w:r>
+        <w:rPr>
+          <w:sz w:val="28"/>
+          <w:szCs w:val="28"/>
+          <w:lang w:val="en-US"/>
+        </w:rPr>
+        <w:t>5, 4))</w:t>
+      </w:r>
+    </w:p>
+    <w:p>
+      <w:pPr>
+        <w:rPr>
+          <w:sz w:val="28"/>
+          <w:szCs w:val="28"/>
+        </w:rPr>
+      </w:pPr>
+      <w:proofErr w:type="spellStart"/>
+      <w:proofErr w:type="gramStart"/>
+      <w:r>
+        <w:rPr>
+          <w:sz w:val="28"/>
+          <w:szCs w:val="28"/>
+          <w:lang w:val="en-US"/>
+        </w:rPr>
+        <w:t>sns.heatmap</w:t>
+      </w:r>
+      <w:proofErr w:type="spellEnd"/>
+      <w:proofErr w:type="gramEnd"/>
+      <w:r>
+        <w:rPr>
+          <w:sz w:val="28"/>
+          <w:szCs w:val="28"/>
+          <w:lang w:val="en-US"/>
+        </w:rPr>
+        <w:t xml:space="preserve">(cm, </w:t>
+      </w:r>
+      <w:proofErr w:type="spellStart"/>
+      <w:r>
+        <w:rPr>
+          <w:sz w:val="28"/>
+          <w:szCs w:val="28"/>
+          <w:lang w:val="en-US"/>
+        </w:rPr>
+        <w:t>annot</w:t>
+      </w:r>
+      <w:proofErr w:type="spellEnd"/>
+      <w:r>
+        <w:rPr>
+          <w:sz w:val="28"/>
+          <w:szCs w:val="28"/>
+          <w:lang w:val="en-US"/>
+        </w:rPr>
+        <w:t xml:space="preserve">=True, </w:t>
+      </w:r>
+      <w:proofErr w:type="spellStart"/>
+      <w:r>
+        <w:rPr>
+          <w:sz w:val="28"/>
+          <w:szCs w:val="28"/>
+          <w:lang w:val="en-US"/>
+        </w:rPr>
+        <w:t>fmt</w:t>
+      </w:r>
+      <w:proofErr w:type="spellEnd"/>
+      <w:r>
+        <w:rPr>
+          <w:sz w:val="28"/>
+          <w:szCs w:val="28"/>
+          <w:lang w:val="en-US"/>
+        </w:rPr>
+        <w:t xml:space="preserve">='d', </w:t>
+      </w:r>
+      <w:proofErr w:type="spellStart"/>
+      <w:r>
+        <w:rPr>
+          <w:sz w:val="28"/>
+          <w:szCs w:val="28"/>
+          <w:lang w:val="en-US"/>
+        </w:rPr>
+        <w:t>cmap</w:t>
+      </w:r>
+      <w:proofErr w:type="spellEnd"/>
+      <w:r>
+        <w:rPr>
+          <w:sz w:val="28"/>
+          <w:szCs w:val="28"/>
+          <w:lang w:val="en-US"/>
+        </w:rPr>
+        <w:t>='Blues', cbar=False)</w:t>
+      </w:r>
+    </w:p>
+    <w:p>
+      <w:pPr>
+        <w:rPr>
+          <w:sz w:val="28"/>
+          <w:szCs w:val="28"/>
+        </w:rPr>
+      </w:pPr>
+      <w:proofErr w:type="spellStart"/>
+      <w:proofErr w:type="gramStart"/>
+      <w:r>
+        <w:rPr>
+          <w:sz w:val="28"/>
+          <w:szCs w:val="28"/>
+          <w:lang w:val="en-US"/>
+        </w:rPr>
+        <w:t>plt.title</w:t>
+      </w:r>
+      <w:proofErr w:type="spellEnd"/>
+      <w:proofErr w:type="gramEnd"/>
+      <w:r>
+        <w:rPr>
+          <w:sz w:val="28"/>
+          <w:szCs w:val="28"/>
+          <w:lang w:val="en-US"/>
+        </w:rPr>
+        <w:t>("Confusion Matrix")</w:t>
+      </w:r>
+    </w:p>
+    <w:p>
+      <w:pPr>
+        <w:rPr>
+          <w:sz w:val="28"/>
+          <w:szCs w:val="28"/>
+        </w:rPr>
+      </w:pPr>
+      <w:proofErr w:type="spellStart"/>
+      <w:proofErr w:type="gramStart"/>
+      <w:r>
+        <w:rPr>
+          <w:sz w:val="28"/>
+          <w:szCs w:val="28"/>
+          <w:lang w:val="en-US"/>
+        </w:rPr>
+        <w:t>plt.xlabel</w:t>
+      </w:r>
+      <w:proofErr w:type="spellEnd"/>
+      <w:proofErr w:type="gramEnd"/>
+      <w:r>
+        <w:rPr>
+          <w:sz w:val="28"/>
+          <w:szCs w:val="28"/>
+          <w:lang w:val="en-US"/>
+        </w:rPr>
+        <w:t>("Predicted")</w:t>
+      </w:r>
+    </w:p>
+    <w:p>
+      <w:pPr>
+        <w:rPr>
+          <w:sz w:val="28"/>
+          <w:szCs w:val="28"/>
+        </w:rPr>
+      </w:pPr>
+      <w:proofErr w:type="spellStart"/>
+      <w:proofErr w:type="gramStart"/>
+      <w:r>
+        <w:rPr>
+          <w:sz w:val="28"/>
+          <w:szCs w:val="28"/>
+          <w:lang w:val="en-US"/>
+        </w:rPr>
+        <w:t>plt.ylabel</w:t>
+      </w:r>
+      <w:proofErr w:type="spellEnd"/>
+      <w:proofErr w:type="gramEnd"/>
+      <w:r>
+        <w:rPr>
+          <w:sz w:val="28"/>
+          <w:szCs w:val="28"/>
+          <w:lang w:val="en-US"/>
+        </w:rPr>
+        <w:t>("Actual")</w:t>
+      </w:r>
+    </w:p>
+    <w:p>
+      <w:pPr>
+        <w:rPr>
+          <w:sz w:val="28"/>
+          <w:szCs w:val="28"/>
+        </w:rPr>
+      </w:pPr>
+      <w:proofErr w:type="spellStart"/>
+      <w:proofErr w:type="gramStart"/>
+      <w:r>
+        <w:rPr>
+          <w:sz w:val="28"/>
+          <w:szCs w:val="28"/>
+          <w:lang w:val="en-US"/>
+        </w:rPr>
+        <w:t>plt.show</w:t>
+      </w:r>
+      <w:proofErr w:type="spellEnd"/>
+      <w:proofErr w:type="gramEnd"/>
+      <w:r>
+        <w:rPr>
+          <w:sz w:val="28"/>
+          <w:szCs w:val="28"/>
+          <w:lang w:val="en-US"/>
+        </w:rPr>
+        <w:t>()</w:t>
+      </w:r>
+    </w:p>
+    <w:p>
+      <w:pPr>
+        <w:rPr>
+          <w:sz w:val="28"/>
+          <w:szCs w:val="28"/>
+        </w:rPr>
+      </w:pPr>
+      <w:r>
+        <w:rPr>
+          <w:sz w:val="28"/>
+          <w:szCs w:val="28"/>
+          <w:lang w:val="en-US"/>
+        </w:rPr>
+        <w:lastRenderedPageBreak/>
+        <w:t># Feature importance</w:t>
+      </w:r>
+    </w:p>
+    <w:p>
+      <w:pPr>
+        <w:rPr>
+          <w:sz w:val="28"/>
+          <w:szCs w:val="28"/>
+        </w:rPr>
+      </w:pPr>
+      <w:r>
+        <w:rPr>
+          <w:sz w:val="28"/>
+          <w:szCs w:val="28"/>
+          <w:lang w:val="en-US"/>
+        </w:rPr>
+        <w:t xml:space="preserve">importance = </w:t>
+      </w:r>
+      <w:proofErr w:type="spellStart"/>
+      <w:proofErr w:type="gramStart"/>
+      <w:r>
+        <w:rPr>
+          <w:sz w:val="28"/>
+          <w:szCs w:val="28"/>
+          <w:lang w:val="en-US"/>
+        </w:rPr>
+        <w:t>pd.Series</w:t>
+      </w:r>
+      <w:proofErr w:type="spellEnd"/>
+      <w:proofErr w:type="gramEnd"/>
+      <w:r>
+        <w:rPr>
+          <w:sz w:val="28"/>
+          <w:szCs w:val="28"/>
+          <w:lang w:val="en-US"/>
+        </w:rPr>
+        <w:t>(</w:t>
+      </w:r>
+      <w:proofErr w:type="spellStart"/>
+      <w:proofErr w:type="gramStart"/>
+      <w:r>
+        <w:rPr>
+          <w:sz w:val="28"/>
+          <w:szCs w:val="28"/>
+          <w:lang w:val="en-US"/>
+        </w:rPr>
+        <w:t>model.feature</w:t>
+      </w:r>
+      <w:proofErr w:type="gramEnd"/>
+      <w:r>
+        <w:rPr>
+          <w:sz w:val="28"/>
+          <w:szCs w:val="28"/>
+          <w:lang w:val="en-US"/>
+        </w:rPr>
+        <w:t>_importances</w:t>
+      </w:r>
+      <w:proofErr w:type="spellEnd"/>
+      <w:r>
+        <w:rPr>
+          <w:sz w:val="28"/>
+          <w:szCs w:val="28"/>
+          <w:lang w:val="en-US"/>
+        </w:rPr>
+        <w:t>_, index=</w:t>
+      </w:r>
+      <w:proofErr w:type="spellStart"/>
+      <w:r>
+        <w:rPr>
+          <w:sz w:val="28"/>
+          <w:szCs w:val="28"/>
+          <w:lang w:val="en-US"/>
+        </w:rPr>
+        <w:t>X.columns</w:t>
+      </w:r>
+      <w:proofErr w:type="spellEnd"/>
+      <w:r>
+        <w:rPr>
+          <w:sz w:val="28"/>
+          <w:szCs w:val="28"/>
+          <w:lang w:val="en-US"/>
+        </w:rPr>
+        <w:t>)</w:t>
+      </w:r>
+    </w:p>
+    <w:p>
+      <w:pPr>
+        <w:rPr>
+          <w:sz w:val="28"/>
+          <w:szCs w:val="28"/>
+        </w:rPr>
+      </w:pPr>
+      <w:r>
+        <w:rPr>
+          <w:sz w:val="28"/>
+          <w:szCs w:val="28"/>
+          <w:lang w:val="en-US"/>
+        </w:rPr>
+        <w:t xml:space="preserve">importance = </w:t>
+      </w:r>
+      <w:proofErr w:type="spellStart"/>
+      <w:proofErr w:type="gramStart"/>
+      <w:r>
+        <w:rPr>
+          <w:sz w:val="28"/>
+          <w:szCs w:val="28"/>
+          <w:lang w:val="en-US"/>
+        </w:rPr>
+        <w:t>importance.sort</w:t>
+      </w:r>
+      <w:proofErr w:type="gramEnd"/>
+      <w:r>
+        <w:rPr>
+          <w:sz w:val="28"/>
+          <w:szCs w:val="28"/>
+          <w:lang w:val="en-US"/>
+        </w:rPr>
+        <w:t>_values</w:t>
+      </w:r>
+      <w:proofErr w:type="spellEnd"/>
+      <w:r>
+        <w:rPr>
+          <w:sz w:val="28"/>
+          <w:szCs w:val="28"/>
+          <w:lang w:val="en-US"/>
+        </w:rPr>
+        <w:t>(ascending=False)</w:t>
+      </w:r>
+    </w:p>
+    <w:p>
+      <w:pPr>
+        <w:rPr>
+          <w:sz w:val="28"/>
+          <w:szCs w:val="28"/>
+        </w:rPr>
+      </w:pPr>
+      <w:proofErr w:type="spellStart"/>
+      <w:proofErr w:type="gramStart"/>
+      <w:r>
+        <w:rPr>
+          <w:sz w:val="28"/>
+          <w:szCs w:val="28"/>
+          <w:lang w:val="en-US"/>
+        </w:rPr>
+        <w:t>plt.figure</w:t>
+      </w:r>
+      <w:proofErr w:type="spellEnd"/>
+      <w:proofErr w:type="gramEnd"/>
+      <w:r>
+        <w:rPr>
+          <w:sz w:val="28"/>
+          <w:szCs w:val="28"/>
+          <w:lang w:val="en-US"/>
+        </w:rPr>
+        <w:t>(</w:t>
+      </w:r>
+      <w:proofErr w:type="spellStart"/>
+      <w:r>
+        <w:rPr>
+          <w:sz w:val="28"/>
+          <w:szCs w:val="28"/>
+          <w:lang w:val="en-US"/>
+        </w:rPr>
+        <w:t>figsize</w:t>
+      </w:r>
+      <w:proofErr w:type="spellEnd"/>
+      <w:proofErr w:type="gramStart"/>
+      <w:r>
+        <w:rPr>
+          <w:sz w:val="28"/>
+          <w:szCs w:val="28"/>
+          <w:lang w:val="en-US"/>
+        </w:rPr>
+        <w:t>=(</w:t>
+      </w:r>
+      <w:proofErr w:type="gramEnd"/>
+      <w:r>
+        <w:rPr>
+          <w:sz w:val="28"/>
+          <w:szCs w:val="28"/>
+          <w:lang w:val="en-US"/>
+        </w:rPr>
+        <w:t>8, 5))</w:t>
+      </w:r>
+    </w:p>
+    <w:p>
+      <w:pPr>
+        <w:rPr>
+          <w:sz w:val="28"/>
+          <w:szCs w:val="28"/>
+        </w:rPr>
+      </w:pPr>
+      <w:proofErr w:type="spellStart"/>
+      <w:proofErr w:type="gramStart"/>
+      <w:r>
+        <w:rPr>
+          <w:sz w:val="28"/>
+          <w:szCs w:val="28"/>
+          <w:lang w:val="en-US"/>
+        </w:rPr>
+        <w:t>sns.barplot</w:t>
+      </w:r>
+      <w:proofErr w:type="spellEnd"/>
+      <w:proofErr w:type="gramEnd"/>
+      <w:r>
+        <w:rPr>
+          <w:sz w:val="28"/>
+          <w:szCs w:val="28"/>
+          <w:lang w:val="en-US"/>
+        </w:rPr>
+        <w:t>(x=importance, y=</w:t>
+      </w:r>
+      <w:proofErr w:type="spellStart"/>
+      <w:proofErr w:type="gramStart"/>
+      <w:r>
+        <w:rPr>
+          <w:sz w:val="28"/>
+          <w:szCs w:val="28"/>
+          <w:lang w:val="en-US"/>
+        </w:rPr>
+        <w:t>importance.index</w:t>
+      </w:r>
+      <w:proofErr w:type="spellEnd"/>
+      <w:proofErr w:type="gramEnd"/>
+      <w:r>
+        <w:rPr>
+          <w:sz w:val="28"/>
+          <w:szCs w:val="28"/>
+          <w:lang w:val="en-US"/>
+        </w:rPr>
+        <w:t>, hue=</w:t>
+      </w:r>
+      <w:proofErr w:type="spellStart"/>
+      <w:proofErr w:type="gramStart"/>
+      <w:r>
+        <w:rPr>
+          <w:sz w:val="28"/>
+          <w:szCs w:val="28"/>
+          <w:lang w:val="en-US"/>
+        </w:rPr>
+        <w:t>importance.index</w:t>
+      </w:r>
+      <w:proofErr w:type="spellEnd"/>
+      <w:proofErr w:type="gramEnd"/>
+      <w:r>
+        <w:rPr>
+          <w:sz w:val="28"/>
+          <w:szCs w:val="28"/>
+          <w:lang w:val="en-US"/>
+        </w:rPr>
+        <w:t>, palette='</w:t>
+      </w:r>
+      <w:proofErr w:type="spellStart"/>
+      <w:r>
+        <w:rPr>
+          <w:sz w:val="28"/>
+          <w:szCs w:val="28"/>
+          <w:lang w:val="en-US"/>
+        </w:rPr>
+        <w:t>viridis</w:t>
+      </w:r>
+      <w:proofErr w:type="spellEnd"/>
+      <w:r>
+        <w:rPr>
+          <w:sz w:val="28"/>
+          <w:szCs w:val="28"/>
+          <w:lang w:val="en-US"/>
+        </w:rPr>
+        <w:t>', legend=False) # Changed colormap here</w:t>
+      </w:r>
+    </w:p>
+    <w:p>
+      <w:pPr>
+        <w:rPr>
+          <w:sz w:val="28"/>
+          <w:szCs w:val="28"/>
+        </w:rPr>
+      </w:pPr>
+      <w:proofErr w:type="spellStart"/>
+      <w:proofErr w:type="gramStart"/>
+      <w:r>
+        <w:rPr>
+          <w:sz w:val="28"/>
+          <w:szCs w:val="28"/>
+          <w:lang w:val="en-US"/>
+        </w:rPr>
+        <w:t>plt.title</w:t>
+      </w:r>
+      <w:proofErr w:type="spellEnd"/>
+      <w:proofErr w:type="gramEnd"/>
+      <w:r>
+        <w:rPr>
+          <w:sz w:val="28"/>
+          <w:szCs w:val="28"/>
+          <w:lang w:val="en-US"/>
+        </w:rPr>
+        <w:t>("Feature Importance (Gradient Boosting)")</w:t>
+      </w:r>
+    </w:p>
+    <w:p>
+      <w:pPr>
+        <w:rPr>
+          <w:sz w:val="28"/>
+          <w:szCs w:val="28"/>
+        </w:rPr>
+      </w:pPr>
+      <w:proofErr w:type="spellStart"/>
+      <w:proofErr w:type="gramStart"/>
+      <w:r>
+        <w:rPr>
+          <w:sz w:val="28"/>
+          <w:szCs w:val="28"/>
+          <w:lang w:val="en-US"/>
+        </w:rPr>
+        <w:t>plt.xlabel</w:t>
+      </w:r>
+      <w:proofErr w:type="spellEnd"/>
+      <w:proofErr w:type="gramEnd"/>
+      <w:r>
+        <w:rPr>
+          <w:sz w:val="28"/>
+          <w:szCs w:val="28"/>
+          <w:lang w:val="en-US"/>
+        </w:rPr>
+        <w:t>("Importance Score")</w:t>
+      </w:r>
+    </w:p>
+    <w:p>
+      <w:pPr>
+        <w:rPr>
+          <w:sz w:val="28"/>
+          <w:szCs w:val="28"/>
+        </w:rPr>
+      </w:pPr>
+      <w:proofErr w:type="spellStart"/>
+      <w:proofErr w:type="gramStart"/>
+      <w:r>
+        <w:rPr>
+          <w:sz w:val="28"/>
+          <w:szCs w:val="28"/>
+          <w:lang w:val="en-US"/>
+        </w:rPr>
+        <w:t>plt.ylabel</w:t>
+      </w:r>
+      <w:proofErr w:type="spellEnd"/>
+      <w:proofErr w:type="gramEnd"/>
+      <w:r>
+        <w:rPr>
+          <w:sz w:val="28"/>
+          <w:szCs w:val="28"/>
+          <w:lang w:val="en-US"/>
+        </w:rPr>
+        <w:t>("Feature")</w:t>
+      </w:r>
+    </w:p>
+    <w:p>
+      <w:pPr>
+        <w:rPr>
+          <w:sz w:val="28"/>
+          <w:szCs w:val="28"/>
+        </w:rPr>
+      </w:pPr>
+      <w:proofErr w:type="spellStart"/>
+      <w:proofErr w:type="gramStart"/>
+      <w:r>
+        <w:rPr>
+          <w:sz w:val="28"/>
+          <w:szCs w:val="28"/>
+          <w:lang w:val="en-US"/>
+        </w:rPr>
+        <w:t>plt.show</w:t>
+      </w:r>
+      <w:proofErr w:type="spellEnd"/>
+      <w:proofErr w:type="gramEnd"/>
+      <w:r>
+        <w:rPr>
+          <w:sz w:val="28"/>
+          <w:szCs w:val="28"/>
+          <w:lang w:val="en-US"/>
+        </w:rPr>
+        <w:t>()</w:t>
+      </w:r>
+    </w:p>
+    <w:p>
+      <w:pPr>
+        <w:rPr>
+          <w:b/>
+          <w:sz w:val="28"/>
+          <w:szCs w:val="28"/>
+        </w:rPr>
+      </w:pPr>
+    </w:p>
+    <w:p>
+      <w:pPr>
+        <w:rPr>
+          <w:b/>
+          <w:sz w:val="28"/>
+          <w:szCs w:val="28"/>
+        </w:rPr>
+      </w:pPr>
+    </w:p>
+    <w:p>
+      <w:pPr>
+        <w:rPr>
+          <w:b/>
+          <w:sz w:val="28"/>
+          <w:szCs w:val="28"/>
+        </w:rPr>
+      </w:pPr>
+      <w:r>
+        <w:rPr>
+          <w:b/>
+          <w:sz w:val="28"/>
+          <w:szCs w:val="28"/>
+        </w:rPr>
+        <w:t>OUTPUT:</w:t>
+      </w:r>
+    </w:p>
+    <w:p>
+      <w:pPr>
+        <w:rPr>
+          <w:b/>
+          <w:sz w:val="28"/>
+          <w:szCs w:val="28"/>
+        </w:rPr>
+      </w:pPr>
+      <w:r>
+        <w:rPr>
+          <w:b/>
+          <w:sz w:val="28"/>
+          <w:szCs w:val="28"/>
+        </w:rPr>
+        <w:drawing>
+          <wp:inline distT="0" distB="0" distL="0" distR="0" wp14:anchorId="0999F21A" wp14:editId="51035542">
+            <wp:extent cx="3924300" cy="1746250"/>
+            <wp:effectExtent l="0" t="0" r="0" b="6350"/>
+            <wp:docPr id="1159766784" name="Picture 11"/>
+            <wp:cNvGraphicFramePr>
+              <a:graphicFrameLocks xmlns:a="http://schemas.openxmlformats.org/drawingml/2006/main" noChangeAspect="1"/>
+            </wp:cNvGraphicFramePr>
+            <a:graphic xmlns:a="http://schemas.openxmlformats.org/drawingml/2006/main">
+              <a:graphicData uri="http://schemas.openxmlformats.org/drawingml/2006/picture">
+                <pic:pic xmlns:pic="http://schemas.openxmlformats.org/drawingml/2006/picture">
+                  <pic:nvPicPr>
+                    <pic:cNvPr id="0" name="Picture 1"/>
+                    <pic:cNvPicPr>
+                      <a:picLocks noChangeAspect="1" noChangeArrowheads="1"/>
+                    </pic:cNvPicPr>
+                  </pic:nvPicPr>
+                  <pic:blipFill>
+                    <a:blip r:embed="rId81">
+                      <a:extLst>
+                        <a:ext uri="{28A0092B-C50C-407E-A947-70E740481C1C}">
+                          <a14:useLocalDpi xmlns:a14="http://schemas.microsoft.com/office/drawing/2010/main" val="0"/>
+                        </a:ext>
+                      </a:extLst>
+                    </a:blip>
+                    <a:srcRect/>
+                    <a:stretch>
+                      <a:fillRect/>
+                    </a:stretch>
+                  </pic:blipFill>
+                  <pic:spPr bwMode="auto">
+                    <a:xfrm>
+                      <a:off x="0" y="0"/>
+                      <a:ext cx="3924300" cy="1746250"/>
+                    </a:xfrm>
+                    <a:prstGeom prst="rect">
+                      <a:avLst/>
+                    </a:prstGeom>
+                    <a:noFill/>
+                    <a:ln>
+                      <a:noFill/>
+                    </a:ln>
+                  </pic:spPr>
+                </pic:pic>
+              </a:graphicData>
+            </a:graphic>
+          </wp:inline>
+        </w:drawing>
+      </w:r>
+    </w:p>
+    <w:p>
+      <w:pPr>
+        <w:rPr>
+          <w:b/>
+          <w:sz w:val="28"/>
+          <w:szCs w:val="28"/>
+        </w:rPr>
+      </w:pPr>
+    </w:p>
+    <w:p>
+      <w:pPr>
+        <w:rPr>
+          <w:b/>
+          <w:sz w:val="28"/>
+          <w:szCs w:val="28"/>
+        </w:rPr>
+      </w:pPr>
+      <w:r>
+        <w:rPr>
+          <w:b/>
+          <w:sz w:val="28"/>
+          <w:szCs w:val="28"/>
+        </w:rPr>
+        <w:drawing>
+          <wp:inline distT="0" distB="0" distL="0" distR="0" wp14:anchorId="71E97BCD" wp14:editId="71D7D258">
+            <wp:extent cx="3689350" cy="2311400"/>
+            <wp:effectExtent l="0" t="0" r="6350" b="0"/>
+            <wp:docPr id="381793632" name="Picture 10"/>
+            <wp:cNvGraphicFramePr>
+              <a:graphicFrameLocks xmlns:a="http://schemas.openxmlformats.org/drawingml/2006/main" noChangeAspect="1"/>
+            </wp:cNvGraphicFramePr>
+            <a:graphic xmlns:a="http://schemas.openxmlformats.org/drawingml/2006/main">
+              <a:graphicData uri="http://schemas.openxmlformats.org/drawingml/2006/picture">
+                <pic:pic xmlns:pic="http://schemas.openxmlformats.org/drawingml/2006/picture">
+                  <pic:nvPicPr>
+                    <pic:cNvPr id="0" name="Picture 2"/>
+                    <pic:cNvPicPr>
+                      <a:picLocks noChangeAspect="1" noChangeArrowheads="1"/>
+                    </pic:cNvPicPr>
+                  </pic:nvPicPr>
+                  <pic:blipFill>
+                    <a:blip r:embed="rId82">
+                      <a:extLst>
+                        <a:ext uri="{28A0092B-C50C-407E-A947-70E740481C1C}">
+                          <a14:useLocalDpi xmlns:a14="http://schemas.microsoft.com/office/drawing/2010/main" val="0"/>
+                        </a:ext>
+                      </a:extLst>
+                    </a:blip>
+                    <a:srcRect/>
+                    <a:stretch>
+                      <a:fillRect/>
+                    </a:stretch>
+                  </pic:blipFill>
+                  <pic:spPr bwMode="auto">
+                    <a:xfrm>
+                      <a:off x="0" y="0"/>
+                      <a:ext cx="3689350" cy="2311400"/>
+                    </a:xfrm>
+                    <a:prstGeom prst="rect">
+                      <a:avLst/>
+                    </a:prstGeom>
+                    <a:noFill/>
+                    <a:ln>
+                      <a:noFill/>
+                    </a:ln>
+                  </pic:spPr>
+                </pic:pic>
+              </a:graphicData>
+            </a:graphic>
+          </wp:inline>
+        </w:drawing>
+      </w:r>
+    </w:p>
+    <w:p>
+      <w:pPr>
+        <w:rPr>
+          <w:b/>
+          <w:sz w:val="28"/>
+          <w:szCs w:val="28"/>
+        </w:rPr>
+      </w:pPr>
+    </w:p>
+    <w:p>
+      <w:pPr>
+        <w:rPr>
+          <w:b/>
+          <w:sz w:val="28"/>
+          <w:szCs w:val="28"/>
+        </w:rPr>
+      </w:pPr>
+    </w:p>
+    <w:p>
+      <w:pPr>
+        <w:rPr>
+          <w:b/>
+          <w:sz w:val="28"/>
+          <w:szCs w:val="28"/>
+        </w:rPr>
+      </w:pPr>
+      <w:r>
+        <w:rPr>
+          <w:b/>
+          <w:sz w:val="28"/>
+          <w:szCs w:val="28"/>
+        </w:rPr>
+        <w:lastRenderedPageBreak/>
+        <w:drawing>
+          <wp:inline distT="0" distB="0" distL="0" distR="0" wp14:anchorId="253F55B2" wp14:editId="2FA73223">
+            <wp:extent cx="4438650" cy="2698750"/>
+            <wp:effectExtent l="0" t="0" r="0" b="6350"/>
+            <wp:docPr id="1345110628" name="Picture 9"/>
+            <wp:cNvGraphicFramePr>
+              <a:graphicFrameLocks xmlns:a="http://schemas.openxmlformats.org/drawingml/2006/main" noChangeAspect="1"/>
+            </wp:cNvGraphicFramePr>
+            <a:graphic xmlns:a="http://schemas.openxmlformats.org/drawingml/2006/main">
+              <a:graphicData uri="http://schemas.openxmlformats.org/drawingml/2006/picture">
+                <pic:pic xmlns:pic="http://schemas.openxmlformats.org/drawingml/2006/picture">
+                  <pic:nvPicPr>
+                    <pic:cNvPr id="0" name="Picture 3"/>
+                    <pic:cNvPicPr>
+                      <a:picLocks noChangeAspect="1" noChangeArrowheads="1"/>
+                    </pic:cNvPicPr>
+                  </pic:nvPicPr>
+                  <pic:blipFill>
+                    <a:blip r:embed="rId83">
+                      <a:extLst>
+                        <a:ext uri="{28A0092B-C50C-407E-A947-70E740481C1C}">
+                          <a14:useLocalDpi xmlns:a14="http://schemas.microsoft.com/office/drawing/2010/main" val="0"/>
+                        </a:ext>
+                      </a:extLst>
+                    </a:blip>
+                    <a:srcRect/>
+                    <a:stretch>
+                      <a:fillRect/>
+                    </a:stretch>
+                  </pic:blipFill>
+                  <pic:spPr bwMode="auto">
+                    <a:xfrm>
+                      <a:off x="0" y="0"/>
+                      <a:ext cx="4438650" cy="2698750"/>
+                    </a:xfrm>
+                    <a:prstGeom prst="rect">
+                      <a:avLst/>
+                    </a:prstGeom>
+                    <a:noFill/>
+                    <a:ln>
+                      <a:noFill/>
+                    </a:ln>
+                  </pic:spPr>
+                </pic:pic>
+              </a:graphicData>
+            </a:graphic>
+          </wp:inline>
+        </w:drawing>
+      </w:r>
+    </w:p>
+    <w:p>
+      <w:pPr>
+        <w:rPr>
+          <w:b/>
+          <w:sz w:val="28"/>
+          <w:szCs w:val="28"/>
+        </w:rPr>
+      </w:pPr>
+    </w:p>
+    <w:p>
+      <w:pPr>
+        <w:rPr>
+          <w:b/>
+          <w:sz w:val="28"/>
+          <w:szCs w:val="28"/>
+        </w:rPr>
+      </w:pPr>
+      <w:r>
+        <w:rPr>
+          <w:b/>
+          <w:sz w:val="28"/>
+          <w:szCs w:val="28"/>
+        </w:rPr>
+        <w:t>LEARNING OUTCOME:</w:t>
+      </w:r>
+    </w:p>
+    <w:p>
+      <w:pPr>
+        <w:rPr>
+          <w:b/>
+          <w:sz w:val="28"/>
+          <w:szCs w:val="28"/>
+          <w:lang w:val="en-IN"/>
+        </w:rPr>
+      </w:pPr>
     </w:p>
     <w:sectPr>
       <w:pgSz w:w="12240" w:h="15840"/>
@@ -23892,7 +27082,6 @@
   <w:style w:type="character" w:default="1" w:styleId="DefaultParagraphFont">
     <w:name w:val="Default Paragraph Font"/>
     <w:uiPriority w:val="1"/>
-    <w:semiHidden/>
     <w:unhideWhenUsed/>
   </w:style>
   <w:style w:type="table" w:default="1" w:styleId="TableNormal">

</xml_diff>